<commit_message>
docs: update project documentation with code structure and user requirements for Distribuciones Globales S.A.
</commit_message>
<xml_diff>
--- a/Quinto_Semestre/Ingenieria Web/ejercicios_clase/distribuciones_globales_sa/Distribuciones_Globales_SA.docx
+++ b/Quinto_Semestre/Ingenieria Web/ejercicios_clase/distribuciones_globales_sa/Distribuciones_Globales_SA.docx
@@ -382,6 +382,1542 @@
           <w:bCs/>
         </w:rPr>
         <w:lastRenderedPageBreak/>
+        <w:t>Estructura del código</w:t>
+      </w:r>
+    </w:p>
+    <w:p>
+      <w:pPr>
+        <w:tabs>
+          <w:tab w:val="left" w:pos="916"/>
+          <w:tab w:val="left" w:pos="1832"/>
+          <w:tab w:val="left" w:pos="2748"/>
+          <w:tab w:val="left" w:pos="3664"/>
+          <w:tab w:val="left" w:pos="4580"/>
+          <w:tab w:val="left" w:pos="5496"/>
+          <w:tab w:val="left" w:pos="6412"/>
+          <w:tab w:val="left" w:pos="7328"/>
+          <w:tab w:val="left" w:pos="8244"/>
+          <w:tab w:val="left" w:pos="9160"/>
+          <w:tab w:val="left" w:pos="10076"/>
+          <w:tab w:val="left" w:pos="10992"/>
+          <w:tab w:val="left" w:pos="11908"/>
+          <w:tab w:val="left" w:pos="12824"/>
+          <w:tab w:val="left" w:pos="13740"/>
+          <w:tab w:val="left" w:pos="14656"/>
+        </w:tabs>
+        <w:spacing w:after="0" w:line="244" w:lineRule="atLeast"/>
+        <w:rPr>
+          <w:rFonts w:ascii="Courier New" w:eastAsia="Times New Roman" w:hAnsi="Courier New" w:cs="Courier New"/>
+          <w:color w:val="333333"/>
+          <w:kern w:val="0"/>
+          <w:sz w:val="20"/>
+          <w:szCs w:val="20"/>
+          <w:lang w:eastAsia="es-CO"/>
+          <w14:ligatures w14:val="none"/>
+        </w:rPr>
+      </w:pPr>
+      <w:proofErr w:type="spellStart"/>
+      <w:r>
+        <w:rPr>
+          <w:rFonts w:ascii="Courier New" w:eastAsia="Times New Roman" w:hAnsi="Courier New" w:cs="Courier New"/>
+          <w:color w:val="333333"/>
+          <w:kern w:val="0"/>
+          <w:sz w:val="20"/>
+          <w:szCs w:val="20"/>
+          <w:lang w:eastAsia="es-CO"/>
+          <w14:ligatures w14:val="none"/>
+        </w:rPr>
+        <w:t>distribuciones_globales_sa</w:t>
+      </w:r>
+      <w:proofErr w:type="spellEnd"/>
+    </w:p>
+    <w:p>
+      <w:pPr>
+        <w:tabs>
+          <w:tab w:val="left" w:pos="916"/>
+          <w:tab w:val="left" w:pos="1832"/>
+          <w:tab w:val="left" w:pos="2748"/>
+          <w:tab w:val="left" w:pos="3664"/>
+          <w:tab w:val="left" w:pos="4580"/>
+          <w:tab w:val="left" w:pos="5496"/>
+          <w:tab w:val="left" w:pos="6412"/>
+          <w:tab w:val="left" w:pos="7328"/>
+          <w:tab w:val="left" w:pos="8244"/>
+          <w:tab w:val="left" w:pos="9160"/>
+          <w:tab w:val="left" w:pos="10076"/>
+          <w:tab w:val="left" w:pos="10992"/>
+          <w:tab w:val="left" w:pos="11908"/>
+          <w:tab w:val="left" w:pos="12824"/>
+          <w:tab w:val="left" w:pos="13740"/>
+          <w:tab w:val="left" w:pos="14656"/>
+        </w:tabs>
+        <w:spacing w:after="0" w:line="244" w:lineRule="atLeast"/>
+        <w:rPr>
+          <w:rFonts w:ascii="Courier New" w:eastAsia="Times New Roman" w:hAnsi="Courier New" w:cs="Courier New"/>
+          <w:color w:val="333333"/>
+          <w:kern w:val="0"/>
+          <w:sz w:val="20"/>
+          <w:szCs w:val="20"/>
+          <w:lang w:eastAsia="es-CO"/>
+          <w14:ligatures w14:val="none"/>
+        </w:rPr>
+      </w:pPr>
+      <w:r>
+        <w:rPr>
+          <w:rFonts w:ascii="Courier New" w:eastAsia="Times New Roman" w:hAnsi="Courier New" w:cs="Courier New"/>
+          <w:color w:val="333333"/>
+          <w:kern w:val="0"/>
+          <w:sz w:val="20"/>
+          <w:szCs w:val="20"/>
+          <w:lang w:eastAsia="es-CO"/>
+          <w14:ligatures w14:val="none"/>
+        </w:rPr>
+        <w:t>├──</w:t>
+      </w:r>
+      <w:r>
+        <w:rPr>
+          <w:rFonts w:ascii="Courier New" w:eastAsia="Times New Roman" w:hAnsi="Courier New" w:cs="Courier New"/>
+          <w:color w:val="CBCBCB"/>
+          <w:kern w:val="0"/>
+          <w:sz w:val="20"/>
+          <w:szCs w:val="20"/>
+          <w:lang w:eastAsia="es-CO"/>
+          <w14:ligatures w14:val="none"/>
+        </w:rPr>
+        <w:t xml:space="preserve"> </w:t>
+      </w:r>
+      <w:r>
+        <w:rPr>
+          <w:rFonts w:ascii="Courier New" w:eastAsia="Times New Roman" w:hAnsi="Courier New" w:cs="Courier New"/>
+          <w:color w:val="333333"/>
+          <w:kern w:val="0"/>
+          <w:sz w:val="20"/>
+          <w:szCs w:val="20"/>
+          <w:lang w:eastAsia="es-CO"/>
+          <w14:ligatures w14:val="none"/>
+        </w:rPr>
+        <w:t>Distribuciones_Globales_SA.docx</w:t>
+      </w:r>
+    </w:p>
+    <w:p>
+      <w:pPr>
+        <w:tabs>
+          <w:tab w:val="left" w:pos="916"/>
+          <w:tab w:val="left" w:pos="1832"/>
+          <w:tab w:val="left" w:pos="2748"/>
+          <w:tab w:val="left" w:pos="3664"/>
+          <w:tab w:val="left" w:pos="4580"/>
+          <w:tab w:val="left" w:pos="5496"/>
+          <w:tab w:val="left" w:pos="6412"/>
+          <w:tab w:val="left" w:pos="7328"/>
+          <w:tab w:val="left" w:pos="8244"/>
+          <w:tab w:val="left" w:pos="9160"/>
+          <w:tab w:val="left" w:pos="10076"/>
+          <w:tab w:val="left" w:pos="10992"/>
+          <w:tab w:val="left" w:pos="11908"/>
+          <w:tab w:val="left" w:pos="12824"/>
+          <w:tab w:val="left" w:pos="13740"/>
+          <w:tab w:val="left" w:pos="14656"/>
+        </w:tabs>
+        <w:spacing w:after="0" w:line="244" w:lineRule="atLeast"/>
+        <w:rPr>
+          <w:rFonts w:ascii="Courier New" w:eastAsia="Times New Roman" w:hAnsi="Courier New" w:cs="Courier New"/>
+          <w:color w:val="333333"/>
+          <w:kern w:val="0"/>
+          <w:sz w:val="20"/>
+          <w:szCs w:val="20"/>
+          <w:lang w:eastAsia="es-CO"/>
+          <w14:ligatures w14:val="none"/>
+        </w:rPr>
+      </w:pPr>
+      <w:r>
+        <w:rPr>
+          <w:rFonts w:ascii="Courier New" w:eastAsia="Times New Roman" w:hAnsi="Courier New" w:cs="Courier New"/>
+          <w:color w:val="333333"/>
+          <w:kern w:val="0"/>
+          <w:sz w:val="20"/>
+          <w:szCs w:val="20"/>
+          <w:lang w:eastAsia="es-CO"/>
+          <w14:ligatures w14:val="none"/>
+        </w:rPr>
+        <w:t>├──</w:t>
+      </w:r>
+      <w:r>
+        <w:rPr>
+          <w:rFonts w:ascii="Courier New" w:eastAsia="Times New Roman" w:hAnsi="Courier New" w:cs="Courier New"/>
+          <w:color w:val="CBCBCB"/>
+          <w:kern w:val="0"/>
+          <w:sz w:val="20"/>
+          <w:szCs w:val="20"/>
+          <w:lang w:eastAsia="es-CO"/>
+          <w14:ligatures w14:val="none"/>
+        </w:rPr>
+        <w:t xml:space="preserve"> </w:t>
+      </w:r>
+      <w:proofErr w:type="spellStart"/>
+      <w:r>
+        <w:rPr>
+          <w:rFonts w:ascii="Courier New" w:eastAsia="Times New Roman" w:hAnsi="Courier New" w:cs="Courier New"/>
+          <w:color w:val="333333"/>
+          <w:kern w:val="0"/>
+          <w:sz w:val="20"/>
+          <w:szCs w:val="20"/>
+          <w:lang w:eastAsia="es-CO"/>
+          <w14:ligatures w14:val="none"/>
+        </w:rPr>
+        <w:t>css</w:t>
+      </w:r>
+      <w:proofErr w:type="spellEnd"/>
+    </w:p>
+    <w:p>
+      <w:pPr>
+        <w:tabs>
+          <w:tab w:val="left" w:pos="916"/>
+          <w:tab w:val="left" w:pos="1832"/>
+          <w:tab w:val="left" w:pos="2748"/>
+          <w:tab w:val="left" w:pos="3664"/>
+          <w:tab w:val="left" w:pos="4580"/>
+          <w:tab w:val="left" w:pos="5496"/>
+          <w:tab w:val="left" w:pos="6412"/>
+          <w:tab w:val="left" w:pos="7328"/>
+          <w:tab w:val="left" w:pos="8244"/>
+          <w:tab w:val="left" w:pos="9160"/>
+          <w:tab w:val="left" w:pos="10076"/>
+          <w:tab w:val="left" w:pos="10992"/>
+          <w:tab w:val="left" w:pos="11908"/>
+          <w:tab w:val="left" w:pos="12824"/>
+          <w:tab w:val="left" w:pos="13740"/>
+          <w:tab w:val="left" w:pos="14656"/>
+        </w:tabs>
+        <w:spacing w:after="0" w:line="244" w:lineRule="atLeast"/>
+        <w:rPr>
+          <w:rFonts w:ascii="Courier New" w:eastAsia="Times New Roman" w:hAnsi="Courier New" w:cs="Courier New"/>
+          <w:color w:val="333333"/>
+          <w:kern w:val="0"/>
+          <w:sz w:val="20"/>
+          <w:szCs w:val="20"/>
+          <w:lang w:eastAsia="es-CO"/>
+          <w14:ligatures w14:val="none"/>
+        </w:rPr>
+      </w:pPr>
+      <w:r>
+        <w:rPr>
+          <w:rFonts w:ascii="Courier New" w:eastAsia="Times New Roman" w:hAnsi="Courier New" w:cs="Courier New"/>
+          <w:color w:val="333333"/>
+          <w:kern w:val="0"/>
+          <w:sz w:val="20"/>
+          <w:szCs w:val="20"/>
+          <w:lang w:eastAsia="es-CO"/>
+          <w14:ligatures w14:val="none"/>
+        </w:rPr>
+        <w:t>│</w:t>
+      </w:r>
+      <w:r>
+        <w:rPr>
+          <w:rFonts w:ascii="Courier New" w:eastAsia="Times New Roman" w:hAnsi="Courier New" w:cs="Courier New"/>
+          <w:color w:val="CBCBCB"/>
+          <w:kern w:val="0"/>
+          <w:sz w:val="20"/>
+          <w:szCs w:val="20"/>
+          <w:lang w:eastAsia="es-CO"/>
+          <w14:ligatures w14:val="none"/>
+        </w:rPr>
+        <w:t xml:space="preserve">   </w:t>
+      </w:r>
+      <w:r>
+        <w:rPr>
+          <w:rFonts w:ascii="Courier New" w:eastAsia="Times New Roman" w:hAnsi="Courier New" w:cs="Courier New"/>
+          <w:color w:val="333333"/>
+          <w:kern w:val="0"/>
+          <w:sz w:val="20"/>
+          <w:szCs w:val="20"/>
+          <w:lang w:eastAsia="es-CO"/>
+          <w14:ligatures w14:val="none"/>
+        </w:rPr>
+        <w:t>└──</w:t>
+      </w:r>
+      <w:r>
+        <w:rPr>
+          <w:rFonts w:ascii="Courier New" w:eastAsia="Times New Roman" w:hAnsi="Courier New" w:cs="Courier New"/>
+          <w:color w:val="CBCBCB"/>
+          <w:kern w:val="0"/>
+          <w:sz w:val="20"/>
+          <w:szCs w:val="20"/>
+          <w:lang w:eastAsia="es-CO"/>
+          <w14:ligatures w14:val="none"/>
+        </w:rPr>
+        <w:t xml:space="preserve"> </w:t>
+      </w:r>
+      <w:r>
+        <w:rPr>
+          <w:rFonts w:ascii="Courier New" w:eastAsia="Times New Roman" w:hAnsi="Courier New" w:cs="Courier New"/>
+          <w:color w:val="333333"/>
+          <w:kern w:val="0"/>
+          <w:sz w:val="20"/>
+          <w:szCs w:val="20"/>
+          <w:lang w:eastAsia="es-CO"/>
+          <w14:ligatures w14:val="none"/>
+        </w:rPr>
+        <w:t>styles.css</w:t>
+      </w:r>
+    </w:p>
+    <w:p>
+      <w:pPr>
+        <w:tabs>
+          <w:tab w:val="left" w:pos="916"/>
+          <w:tab w:val="left" w:pos="1832"/>
+          <w:tab w:val="left" w:pos="2748"/>
+          <w:tab w:val="left" w:pos="3664"/>
+          <w:tab w:val="left" w:pos="4580"/>
+          <w:tab w:val="left" w:pos="5496"/>
+          <w:tab w:val="left" w:pos="6412"/>
+          <w:tab w:val="left" w:pos="7328"/>
+          <w:tab w:val="left" w:pos="8244"/>
+          <w:tab w:val="left" w:pos="9160"/>
+          <w:tab w:val="left" w:pos="10076"/>
+          <w:tab w:val="left" w:pos="10992"/>
+          <w:tab w:val="left" w:pos="11908"/>
+          <w:tab w:val="left" w:pos="12824"/>
+          <w:tab w:val="left" w:pos="13740"/>
+          <w:tab w:val="left" w:pos="14656"/>
+        </w:tabs>
+        <w:spacing w:after="0" w:line="244" w:lineRule="atLeast"/>
+        <w:rPr>
+          <w:rFonts w:ascii="Courier New" w:eastAsia="Times New Roman" w:hAnsi="Courier New" w:cs="Courier New"/>
+          <w:color w:val="333333"/>
+          <w:kern w:val="0"/>
+          <w:sz w:val="20"/>
+          <w:szCs w:val="20"/>
+          <w:lang w:eastAsia="es-CO"/>
+          <w14:ligatures w14:val="none"/>
+        </w:rPr>
+      </w:pPr>
+      <w:r>
+        <w:rPr>
+          <w:rFonts w:ascii="Courier New" w:eastAsia="Times New Roman" w:hAnsi="Courier New" w:cs="Courier New"/>
+          <w:color w:val="333333"/>
+          <w:kern w:val="0"/>
+          <w:sz w:val="20"/>
+          <w:szCs w:val="20"/>
+          <w:lang w:eastAsia="es-CO"/>
+          <w14:ligatures w14:val="none"/>
+        </w:rPr>
+        <w:t>├──</w:t>
+      </w:r>
+      <w:r>
+        <w:rPr>
+          <w:rFonts w:ascii="Courier New" w:eastAsia="Times New Roman" w:hAnsi="Courier New" w:cs="Courier New"/>
+          <w:color w:val="CBCBCB"/>
+          <w:kern w:val="0"/>
+          <w:sz w:val="20"/>
+          <w:szCs w:val="20"/>
+          <w:lang w:eastAsia="es-CO"/>
+          <w14:ligatures w14:val="none"/>
+        </w:rPr>
+        <w:t xml:space="preserve"> </w:t>
+      </w:r>
+      <w:r>
+        <w:rPr>
+          <w:rFonts w:ascii="Courier New" w:eastAsia="Times New Roman" w:hAnsi="Courier New" w:cs="Courier New"/>
+          <w:color w:val="333333"/>
+          <w:kern w:val="0"/>
+          <w:sz w:val="20"/>
+          <w:szCs w:val="20"/>
+          <w:lang w:eastAsia="es-CO"/>
+          <w14:ligatures w14:val="none"/>
+        </w:rPr>
+        <w:t>dashboard.html</w:t>
+      </w:r>
+    </w:p>
+    <w:p>
+      <w:pPr>
+        <w:tabs>
+          <w:tab w:val="left" w:pos="916"/>
+          <w:tab w:val="left" w:pos="1832"/>
+          <w:tab w:val="left" w:pos="2748"/>
+          <w:tab w:val="left" w:pos="3664"/>
+          <w:tab w:val="left" w:pos="4580"/>
+          <w:tab w:val="left" w:pos="5496"/>
+          <w:tab w:val="left" w:pos="6412"/>
+          <w:tab w:val="left" w:pos="7328"/>
+          <w:tab w:val="left" w:pos="8244"/>
+          <w:tab w:val="left" w:pos="9160"/>
+          <w:tab w:val="left" w:pos="10076"/>
+          <w:tab w:val="left" w:pos="10992"/>
+          <w:tab w:val="left" w:pos="11908"/>
+          <w:tab w:val="left" w:pos="12824"/>
+          <w:tab w:val="left" w:pos="13740"/>
+          <w:tab w:val="left" w:pos="14656"/>
+        </w:tabs>
+        <w:spacing w:after="0" w:line="244" w:lineRule="atLeast"/>
+        <w:rPr>
+          <w:rFonts w:ascii="Courier New" w:eastAsia="Times New Roman" w:hAnsi="Courier New" w:cs="Courier New"/>
+          <w:color w:val="333333"/>
+          <w:kern w:val="0"/>
+          <w:sz w:val="20"/>
+          <w:szCs w:val="20"/>
+          <w:lang w:eastAsia="es-CO"/>
+          <w14:ligatures w14:val="none"/>
+        </w:rPr>
+      </w:pPr>
+      <w:r>
+        <w:rPr>
+          <w:rFonts w:ascii="Courier New" w:eastAsia="Times New Roman" w:hAnsi="Courier New" w:cs="Courier New"/>
+          <w:color w:val="333333"/>
+          <w:kern w:val="0"/>
+          <w:sz w:val="20"/>
+          <w:szCs w:val="20"/>
+          <w:lang w:eastAsia="es-CO"/>
+          <w14:ligatures w14:val="none"/>
+        </w:rPr>
+        <w:t>├──</w:t>
+      </w:r>
+      <w:r>
+        <w:rPr>
+          <w:rFonts w:ascii="Courier New" w:eastAsia="Times New Roman" w:hAnsi="Courier New" w:cs="Courier New"/>
+          <w:color w:val="CBCBCB"/>
+          <w:kern w:val="0"/>
+          <w:sz w:val="20"/>
+          <w:szCs w:val="20"/>
+          <w:lang w:eastAsia="es-CO"/>
+          <w14:ligatures w14:val="none"/>
+        </w:rPr>
+        <w:t xml:space="preserve"> </w:t>
+      </w:r>
+      <w:r>
+        <w:rPr>
+          <w:rFonts w:ascii="Courier New" w:eastAsia="Times New Roman" w:hAnsi="Courier New" w:cs="Courier New"/>
+          <w:color w:val="333333"/>
+          <w:kern w:val="0"/>
+          <w:sz w:val="20"/>
+          <w:szCs w:val="20"/>
+          <w:lang w:eastAsia="es-CO"/>
+          <w14:ligatures w14:val="none"/>
+        </w:rPr>
+        <w:t>index.html</w:t>
+      </w:r>
+    </w:p>
+    <w:p>
+      <w:pPr>
+        <w:tabs>
+          <w:tab w:val="left" w:pos="916"/>
+          <w:tab w:val="left" w:pos="1832"/>
+          <w:tab w:val="left" w:pos="2748"/>
+          <w:tab w:val="left" w:pos="3664"/>
+          <w:tab w:val="left" w:pos="4580"/>
+          <w:tab w:val="left" w:pos="5496"/>
+          <w:tab w:val="left" w:pos="6412"/>
+          <w:tab w:val="left" w:pos="7328"/>
+          <w:tab w:val="left" w:pos="8244"/>
+          <w:tab w:val="left" w:pos="9160"/>
+          <w:tab w:val="left" w:pos="10076"/>
+          <w:tab w:val="left" w:pos="10992"/>
+          <w:tab w:val="left" w:pos="11908"/>
+          <w:tab w:val="left" w:pos="12824"/>
+          <w:tab w:val="left" w:pos="13740"/>
+          <w:tab w:val="left" w:pos="14656"/>
+        </w:tabs>
+        <w:spacing w:after="0" w:line="244" w:lineRule="atLeast"/>
+        <w:rPr>
+          <w:rFonts w:ascii="Courier New" w:eastAsia="Times New Roman" w:hAnsi="Courier New" w:cs="Courier New"/>
+          <w:color w:val="333333"/>
+          <w:kern w:val="0"/>
+          <w:sz w:val="20"/>
+          <w:szCs w:val="20"/>
+          <w:lang w:eastAsia="es-CO"/>
+          <w14:ligatures w14:val="none"/>
+        </w:rPr>
+      </w:pPr>
+      <w:r>
+        <w:rPr>
+          <w:rFonts w:ascii="Courier New" w:eastAsia="Times New Roman" w:hAnsi="Courier New" w:cs="Courier New"/>
+          <w:color w:val="333333"/>
+          <w:kern w:val="0"/>
+          <w:sz w:val="20"/>
+          <w:szCs w:val="20"/>
+          <w:lang w:eastAsia="es-CO"/>
+          <w14:ligatures w14:val="none"/>
+        </w:rPr>
+        <w:t>└──</w:t>
+      </w:r>
+      <w:r>
+        <w:rPr>
+          <w:rFonts w:ascii="Courier New" w:eastAsia="Times New Roman" w:hAnsi="Courier New" w:cs="Courier New"/>
+          <w:color w:val="CBCBCB"/>
+          <w:kern w:val="0"/>
+          <w:sz w:val="20"/>
+          <w:szCs w:val="20"/>
+          <w:lang w:eastAsia="es-CO"/>
+          <w14:ligatures w14:val="none"/>
+        </w:rPr>
+        <w:t xml:space="preserve"> </w:t>
+      </w:r>
+      <w:proofErr w:type="spellStart"/>
+      <w:r>
+        <w:rPr>
+          <w:rFonts w:ascii="Courier New" w:eastAsia="Times New Roman" w:hAnsi="Courier New" w:cs="Courier New"/>
+          <w:color w:val="333333"/>
+          <w:kern w:val="0"/>
+          <w:sz w:val="20"/>
+          <w:szCs w:val="20"/>
+          <w:lang w:eastAsia="es-CO"/>
+          <w14:ligatures w14:val="none"/>
+        </w:rPr>
+        <w:t>js</w:t>
+      </w:r>
+      <w:proofErr w:type="spellEnd"/>
+    </w:p>
+    <w:p>
+      <w:pPr>
+        <w:tabs>
+          <w:tab w:val="left" w:pos="916"/>
+          <w:tab w:val="left" w:pos="1832"/>
+          <w:tab w:val="left" w:pos="2748"/>
+          <w:tab w:val="left" w:pos="3664"/>
+          <w:tab w:val="left" w:pos="4580"/>
+          <w:tab w:val="left" w:pos="5496"/>
+          <w:tab w:val="left" w:pos="6412"/>
+          <w:tab w:val="left" w:pos="7328"/>
+          <w:tab w:val="left" w:pos="8244"/>
+          <w:tab w:val="left" w:pos="9160"/>
+          <w:tab w:val="left" w:pos="10076"/>
+          <w:tab w:val="left" w:pos="10992"/>
+          <w:tab w:val="left" w:pos="11908"/>
+          <w:tab w:val="left" w:pos="12824"/>
+          <w:tab w:val="left" w:pos="13740"/>
+          <w:tab w:val="left" w:pos="14656"/>
+        </w:tabs>
+        <w:spacing w:after="0" w:line="244" w:lineRule="atLeast"/>
+        <w:rPr>
+          <w:rFonts w:ascii="Courier New" w:eastAsia="Times New Roman" w:hAnsi="Courier New" w:cs="Courier New"/>
+          <w:color w:val="333333"/>
+          <w:kern w:val="0"/>
+          <w:sz w:val="20"/>
+          <w:szCs w:val="20"/>
+          <w:lang w:eastAsia="es-CO"/>
+          <w14:ligatures w14:val="none"/>
+        </w:rPr>
+      </w:pPr>
+      <w:r>
+        <w:rPr>
+          <w:rFonts w:ascii="Courier New" w:eastAsia="Times New Roman" w:hAnsi="Courier New" w:cs="Courier New"/>
+          <w:color w:val="CBCBCB"/>
+          <w:kern w:val="0"/>
+          <w:sz w:val="20"/>
+          <w:szCs w:val="20"/>
+          <w:lang w:eastAsia="es-CO"/>
+          <w14:ligatures w14:val="none"/>
+        </w:rPr>
+        <w:t xml:space="preserve">    </w:t>
+      </w:r>
+      <w:r>
+        <w:rPr>
+          <w:rFonts w:ascii="Courier New" w:eastAsia="Times New Roman" w:hAnsi="Courier New" w:cs="Courier New"/>
+          <w:color w:val="333333"/>
+          <w:kern w:val="0"/>
+          <w:sz w:val="20"/>
+          <w:szCs w:val="20"/>
+          <w:lang w:eastAsia="es-CO"/>
+          <w14:ligatures w14:val="none"/>
+        </w:rPr>
+        <w:t>├──</w:t>
+      </w:r>
+      <w:r>
+        <w:rPr>
+          <w:rFonts w:ascii="Courier New" w:eastAsia="Times New Roman" w:hAnsi="Courier New" w:cs="Courier New"/>
+          <w:color w:val="CBCBCB"/>
+          <w:kern w:val="0"/>
+          <w:sz w:val="20"/>
+          <w:szCs w:val="20"/>
+          <w:lang w:eastAsia="es-CO"/>
+          <w14:ligatures w14:val="none"/>
+        </w:rPr>
+        <w:t xml:space="preserve"> </w:t>
+      </w:r>
+      <w:r>
+        <w:rPr>
+          <w:rFonts w:ascii="Courier New" w:eastAsia="Times New Roman" w:hAnsi="Courier New" w:cs="Courier New"/>
+          <w:color w:val="333333"/>
+          <w:kern w:val="0"/>
+          <w:sz w:val="20"/>
+          <w:szCs w:val="20"/>
+          <w:lang w:eastAsia="es-CO"/>
+          <w14:ligatures w14:val="none"/>
+        </w:rPr>
+        <w:t>app.js</w:t>
+      </w:r>
+    </w:p>
+    <w:p>
+      <w:pPr>
+        <w:tabs>
+          <w:tab w:val="left" w:pos="916"/>
+          <w:tab w:val="left" w:pos="1832"/>
+          <w:tab w:val="left" w:pos="2748"/>
+          <w:tab w:val="left" w:pos="3664"/>
+          <w:tab w:val="left" w:pos="4580"/>
+          <w:tab w:val="left" w:pos="5496"/>
+          <w:tab w:val="left" w:pos="6412"/>
+          <w:tab w:val="left" w:pos="7328"/>
+          <w:tab w:val="left" w:pos="8244"/>
+          <w:tab w:val="left" w:pos="9160"/>
+          <w:tab w:val="left" w:pos="10076"/>
+          <w:tab w:val="left" w:pos="10992"/>
+          <w:tab w:val="left" w:pos="11908"/>
+          <w:tab w:val="left" w:pos="12824"/>
+          <w:tab w:val="left" w:pos="13740"/>
+          <w:tab w:val="left" w:pos="14656"/>
+        </w:tabs>
+        <w:spacing w:after="0" w:line="244" w:lineRule="atLeast"/>
+        <w:rPr>
+          <w:rFonts w:ascii="Courier New" w:eastAsia="Times New Roman" w:hAnsi="Courier New" w:cs="Courier New"/>
+          <w:color w:val="333333"/>
+          <w:kern w:val="0"/>
+          <w:sz w:val="20"/>
+          <w:szCs w:val="20"/>
+          <w:lang w:eastAsia="es-CO"/>
+          <w14:ligatures w14:val="none"/>
+        </w:rPr>
+      </w:pPr>
+      <w:r>
+        <w:rPr>
+          <w:rFonts w:ascii="Courier New" w:eastAsia="Times New Roman" w:hAnsi="Courier New" w:cs="Courier New"/>
+          <w:color w:val="CBCBCB"/>
+          <w:kern w:val="0"/>
+          <w:sz w:val="20"/>
+          <w:szCs w:val="20"/>
+          <w:lang w:eastAsia="es-CO"/>
+          <w14:ligatures w14:val="none"/>
+        </w:rPr>
+        <w:t xml:space="preserve">    </w:t>
+      </w:r>
+      <w:r>
+        <w:rPr>
+          <w:rFonts w:ascii="Courier New" w:eastAsia="Times New Roman" w:hAnsi="Courier New" w:cs="Courier New"/>
+          <w:color w:val="333333"/>
+          <w:kern w:val="0"/>
+          <w:sz w:val="20"/>
+          <w:szCs w:val="20"/>
+          <w:lang w:eastAsia="es-CO"/>
+          <w14:ligatures w14:val="none"/>
+        </w:rPr>
+        <w:t>└──</w:t>
+      </w:r>
+      <w:r>
+        <w:rPr>
+          <w:rFonts w:ascii="Courier New" w:eastAsia="Times New Roman" w:hAnsi="Courier New" w:cs="Courier New"/>
+          <w:color w:val="CBCBCB"/>
+          <w:kern w:val="0"/>
+          <w:sz w:val="20"/>
+          <w:szCs w:val="20"/>
+          <w:lang w:eastAsia="es-CO"/>
+          <w14:ligatures w14:val="none"/>
+        </w:rPr>
+        <w:t xml:space="preserve"> </w:t>
+      </w:r>
+      <w:r>
+        <w:rPr>
+          <w:rFonts w:ascii="Courier New" w:eastAsia="Times New Roman" w:hAnsi="Courier New" w:cs="Courier New"/>
+          <w:color w:val="333333"/>
+          <w:kern w:val="0"/>
+          <w:sz w:val="20"/>
+          <w:szCs w:val="20"/>
+          <w:lang w:eastAsia="es-CO"/>
+          <w14:ligatures w14:val="none"/>
+        </w:rPr>
+        <w:t>auth.js</w:t>
+      </w:r>
+    </w:p>
+    <w:p>
+      <w:pPr>
+        <w:spacing w:line="276" w:lineRule="auto"/>
+        <w:rPr>
+          <w:rFonts w:ascii="Times New Roman" w:hAnsi="Times New Roman" w:cs="Times New Roman"/>
+          <w:b/>
+          <w:bCs/>
+        </w:rPr>
+      </w:pPr>
+    </w:p>
+    <w:p>
+      <w:pPr>
+        <w:spacing w:line="276" w:lineRule="auto"/>
+        <w:rPr>
+          <w:rFonts w:ascii="Times New Roman" w:hAnsi="Times New Roman" w:cs="Times New Roman"/>
+          <w:b/>
+          <w:bCs/>
+        </w:rPr>
+      </w:pPr>
+      <w:proofErr w:type="spellStart"/>
+      <w:r>
+        <w:rPr>
+          <w:rFonts w:ascii="Times New Roman" w:hAnsi="Times New Roman" w:cs="Times New Roman"/>
+          <w:b/>
+          <w:bCs/>
+        </w:rPr>
+        <w:t>Screenshots</w:t>
+      </w:r>
+      <w:proofErr w:type="spellEnd"/>
+      <w:r>
+        <w:rPr>
+          <w:rFonts w:ascii="Times New Roman" w:hAnsi="Times New Roman" w:cs="Times New Roman"/>
+          <w:b/>
+          <w:bCs/>
+        </w:rPr>
+        <w:t xml:space="preserve"> pagina</w:t>
+      </w:r>
+    </w:p>
+    <w:p>
+      <w:pPr>
+        <w:pStyle w:val="Prrafodelista"/>
+        <w:numPr>
+          <w:ilvl w:val="0"/>
+          <w:numId w:val="16"/>
+        </w:numPr>
+        <w:spacing w:line="276" w:lineRule="auto"/>
+        <w:rPr>
+          <w:rFonts w:ascii="Times New Roman" w:hAnsi="Times New Roman" w:cs="Times New Roman"/>
+          <w:b/>
+          <w:bCs/>
+        </w:rPr>
+      </w:pPr>
+      <w:r>
+        <w:rPr>
+          <w:rFonts w:ascii="Times New Roman" w:hAnsi="Times New Roman" w:cs="Times New Roman"/>
+          <w:b/>
+          <w:bCs/>
+        </w:rPr>
+        <w:t>Login</w:t>
+      </w:r>
+    </w:p>
+    <w:p>
+      <w:pPr>
+        <w:spacing w:line="276" w:lineRule="auto"/>
+        <w:rPr>
+          <w:rFonts w:ascii="Times New Roman" w:hAnsi="Times New Roman" w:cs="Times New Roman"/>
+          <w:b/>
+          <w:bCs/>
+        </w:rPr>
+      </w:pPr>
+      <w:r>
+        <w:rPr>
+          <w:rFonts w:ascii="Times New Roman" w:hAnsi="Times New Roman" w:cs="Times New Roman"/>
+          <w:b/>
+          <w:bCs/>
+        </w:rPr>
+        <w:drawing>
+          <wp:inline distT="0" distB="0" distL="0" distR="0" wp14:anchorId="21380D6A" wp14:editId="6E7CCC0E">
+            <wp:extent cx="5612130" cy="3156585"/>
+            <wp:effectExtent l="0" t="0" r="7620" b="5715"/>
+            <wp:docPr id="510540226" name="Imagen 1" descr="Interfaz de usuario gráfica, Sitio web&#10;&#10;El contenido generado por IA puede ser incorrecto."/>
+            <wp:cNvGraphicFramePr>
+              <a:graphicFrameLocks xmlns:a="http://schemas.openxmlformats.org/drawingml/2006/main" noChangeAspect="1"/>
+            </wp:cNvGraphicFramePr>
+            <a:graphic xmlns:a="http://schemas.openxmlformats.org/drawingml/2006/main">
+              <a:graphicData uri="http://schemas.openxmlformats.org/drawingml/2006/picture">
+                <pic:pic xmlns:pic="http://schemas.openxmlformats.org/drawingml/2006/picture">
+                  <pic:nvPicPr>
+                    <pic:cNvPr id="510540226" name="Imagen 1" descr="Interfaz de usuario gráfica, Sitio web&#10;&#10;El contenido generado por IA puede ser incorrecto."/>
+                    <pic:cNvPicPr/>
+                  </pic:nvPicPr>
+                  <pic:blipFill>
+                    <a:blip r:embed="rId6"/>
+                    <a:stretch>
+                      <a:fillRect/>
+                    </a:stretch>
+                  </pic:blipFill>
+                  <pic:spPr>
+                    <a:xfrm>
+                      <a:off x="0" y="0"/>
+                      <a:ext cx="5612130" cy="3156585"/>
+                    </a:xfrm>
+                    <a:prstGeom prst="rect">
+                      <a:avLst/>
+                    </a:prstGeom>
+                  </pic:spPr>
+                </pic:pic>
+              </a:graphicData>
+            </a:graphic>
+          </wp:inline>
+        </w:drawing>
+      </w:r>
+    </w:p>
+    <w:p>
+      <w:pPr>
+        <w:spacing w:line="276" w:lineRule="auto"/>
+        <w:rPr>
+          <w:rFonts w:ascii="Times New Roman" w:hAnsi="Times New Roman" w:cs="Times New Roman"/>
+          <w:b/>
+          <w:bCs/>
+        </w:rPr>
+      </w:pPr>
+    </w:p>
+    <w:p>
+      <w:pPr>
+        <w:spacing w:line="276" w:lineRule="auto"/>
+        <w:rPr>
+          <w:rFonts w:ascii="Times New Roman" w:hAnsi="Times New Roman" w:cs="Times New Roman"/>
+          <w:b/>
+          <w:bCs/>
+        </w:rPr>
+      </w:pPr>
+    </w:p>
+    <w:p>
+      <w:pPr>
+        <w:spacing w:line="276" w:lineRule="auto"/>
+        <w:rPr>
+          <w:rFonts w:ascii="Times New Roman" w:hAnsi="Times New Roman" w:cs="Times New Roman"/>
+          <w:b/>
+          <w:bCs/>
+        </w:rPr>
+      </w:pPr>
+    </w:p>
+    <w:p>
+      <w:pPr>
+        <w:spacing w:line="276" w:lineRule="auto"/>
+        <w:rPr>
+          <w:rFonts w:ascii="Times New Roman" w:hAnsi="Times New Roman" w:cs="Times New Roman"/>
+          <w:b/>
+          <w:bCs/>
+        </w:rPr>
+      </w:pPr>
+    </w:p>
+    <w:p>
+      <w:pPr>
+        <w:spacing w:line="276" w:lineRule="auto"/>
+        <w:rPr>
+          <w:rFonts w:ascii="Times New Roman" w:hAnsi="Times New Roman" w:cs="Times New Roman"/>
+          <w:b/>
+          <w:bCs/>
+        </w:rPr>
+      </w:pPr>
+    </w:p>
+    <w:p>
+      <w:pPr>
+        <w:spacing w:line="276" w:lineRule="auto"/>
+        <w:rPr>
+          <w:rFonts w:ascii="Times New Roman" w:hAnsi="Times New Roman" w:cs="Times New Roman"/>
+          <w:b/>
+          <w:bCs/>
+        </w:rPr>
+      </w:pPr>
+    </w:p>
+    <w:p>
+      <w:pPr>
+        <w:spacing w:line="276" w:lineRule="auto"/>
+        <w:rPr>
+          <w:rFonts w:ascii="Times New Roman" w:hAnsi="Times New Roman" w:cs="Times New Roman"/>
+          <w:b/>
+          <w:bCs/>
+        </w:rPr>
+      </w:pPr>
+    </w:p>
+    <w:p>
+      <w:pPr>
+        <w:spacing w:line="276" w:lineRule="auto"/>
+        <w:rPr>
+          <w:rFonts w:ascii="Times New Roman" w:hAnsi="Times New Roman" w:cs="Times New Roman"/>
+          <w:b/>
+          <w:bCs/>
+        </w:rPr>
+      </w:pPr>
+    </w:p>
+    <w:p>
+      <w:pPr>
+        <w:pStyle w:val="Prrafodelista"/>
+        <w:numPr>
+          <w:ilvl w:val="0"/>
+          <w:numId w:val="16"/>
+        </w:numPr>
+        <w:spacing w:line="276" w:lineRule="auto"/>
+        <w:rPr>
+          <w:rFonts w:ascii="Times New Roman" w:hAnsi="Times New Roman" w:cs="Times New Roman"/>
+          <w:b/>
+          <w:bCs/>
+        </w:rPr>
+      </w:pPr>
+      <w:proofErr w:type="spellStart"/>
+      <w:r>
+        <w:rPr>
+          <w:rFonts w:ascii="Times New Roman" w:hAnsi="Times New Roman" w:cs="Times New Roman"/>
+          <w:b/>
+          <w:bCs/>
+        </w:rPr>
+        <w:lastRenderedPageBreak/>
+        <w:t>Dashboard</w:t>
+      </w:r>
+      <w:proofErr w:type="spellEnd"/>
+      <w:r>
+        <w:rPr>
+          <w:rFonts w:ascii="Times New Roman" w:hAnsi="Times New Roman" w:cs="Times New Roman"/>
+          <w:b/>
+          <w:bCs/>
+        </w:rPr>
+        <w:t xml:space="preserve"> – </w:t>
+      </w:r>
+      <w:proofErr w:type="spellStart"/>
+      <w:r>
+        <w:rPr>
+          <w:rFonts w:ascii="Times New Roman" w:hAnsi="Times New Roman" w:cs="Times New Roman"/>
+          <w:b/>
+          <w:bCs/>
+        </w:rPr>
+        <w:t>Admin</w:t>
+      </w:r>
+      <w:proofErr w:type="spellEnd"/>
+    </w:p>
+    <w:p>
+      <w:pPr>
+        <w:pStyle w:val="Prrafodelista"/>
+        <w:rPr>
+          <w:rFonts w:ascii="Times New Roman" w:hAnsi="Times New Roman" w:cs="Times New Roman"/>
+          <w:b/>
+          <w:bCs/>
+        </w:rPr>
+      </w:pPr>
+    </w:p>
+    <w:p>
+      <w:pPr>
+        <w:spacing w:line="276" w:lineRule="auto"/>
+        <w:rPr>
+          <w:rFonts w:ascii="Times New Roman" w:hAnsi="Times New Roman" w:cs="Times New Roman"/>
+          <w:b/>
+          <w:bCs/>
+        </w:rPr>
+      </w:pPr>
+      <w:r>
+        <w:rPr>
+          <w:rFonts w:ascii="Times New Roman" w:hAnsi="Times New Roman" w:cs="Times New Roman"/>
+          <w:b/>
+          <w:bCs/>
+        </w:rPr>
+        <w:drawing>
+          <wp:inline distT="0" distB="0" distL="0" distR="0" wp14:anchorId="3A9C9B9B" wp14:editId="1416C9D7">
+            <wp:extent cx="5612130" cy="3156585"/>
+            <wp:effectExtent l="0" t="0" r="7620" b="5715"/>
+            <wp:docPr id="1687719547" name="Imagen 1" descr="Interfaz de usuario gráfica, Aplicación, Correo electrónico&#10;&#10;El contenido generado por IA puede ser incorrecto."/>
+            <wp:cNvGraphicFramePr>
+              <a:graphicFrameLocks xmlns:a="http://schemas.openxmlformats.org/drawingml/2006/main" noChangeAspect="1"/>
+            </wp:cNvGraphicFramePr>
+            <a:graphic xmlns:a="http://schemas.openxmlformats.org/drawingml/2006/main">
+              <a:graphicData uri="http://schemas.openxmlformats.org/drawingml/2006/picture">
+                <pic:pic xmlns:pic="http://schemas.openxmlformats.org/drawingml/2006/picture">
+                  <pic:nvPicPr>
+                    <pic:cNvPr id="1687719547" name="Imagen 1" descr="Interfaz de usuario gráfica, Aplicación, Correo electrónico&#10;&#10;El contenido generado por IA puede ser incorrecto."/>
+                    <pic:cNvPicPr/>
+                  </pic:nvPicPr>
+                  <pic:blipFill>
+                    <a:blip r:embed="rId7"/>
+                    <a:stretch>
+                      <a:fillRect/>
+                    </a:stretch>
+                  </pic:blipFill>
+                  <pic:spPr>
+                    <a:xfrm>
+                      <a:off x="0" y="0"/>
+                      <a:ext cx="5612130" cy="3156585"/>
+                    </a:xfrm>
+                    <a:prstGeom prst="rect">
+                      <a:avLst/>
+                    </a:prstGeom>
+                  </pic:spPr>
+                </pic:pic>
+              </a:graphicData>
+            </a:graphic>
+          </wp:inline>
+        </w:drawing>
+      </w:r>
+    </w:p>
+    <w:p>
+      <w:pPr>
+        <w:pStyle w:val="Prrafodelista"/>
+        <w:numPr>
+          <w:ilvl w:val="0"/>
+          <w:numId w:val="16"/>
+        </w:numPr>
+        <w:spacing w:line="276" w:lineRule="auto"/>
+        <w:rPr>
+          <w:rFonts w:ascii="Times New Roman" w:hAnsi="Times New Roman" w:cs="Times New Roman"/>
+          <w:b/>
+          <w:bCs/>
+        </w:rPr>
+      </w:pPr>
+      <w:r>
+        <w:rPr>
+          <w:rFonts w:ascii="Times New Roman" w:hAnsi="Times New Roman" w:cs="Times New Roman"/>
+          <w:b/>
+          <w:bCs/>
+        </w:rPr>
+        <w:t>Inventario</w:t>
+      </w:r>
+    </w:p>
+    <w:p>
+      <w:pPr>
+        <w:spacing w:line="276" w:lineRule="auto"/>
+        <w:rPr>
+          <w:rFonts w:ascii="Times New Roman" w:hAnsi="Times New Roman" w:cs="Times New Roman"/>
+          <w:b/>
+          <w:bCs/>
+        </w:rPr>
+      </w:pPr>
+      <w:r>
+        <w:rPr>
+          <w:rFonts w:ascii="Times New Roman" w:hAnsi="Times New Roman" w:cs="Times New Roman"/>
+          <w:b/>
+          <w:bCs/>
+        </w:rPr>
+        <w:drawing>
+          <wp:inline distT="0" distB="0" distL="0" distR="0" wp14:anchorId="42AC4778" wp14:editId="72D69708">
+            <wp:extent cx="5612130" cy="3156585"/>
+            <wp:effectExtent l="0" t="0" r="7620" b="5715"/>
+            <wp:docPr id="1940641889" name="Imagen 1" descr="Interfaz de usuario gráfica, Aplicación&#10;&#10;El contenido generado por IA puede ser incorrecto."/>
+            <wp:cNvGraphicFramePr>
+              <a:graphicFrameLocks xmlns:a="http://schemas.openxmlformats.org/drawingml/2006/main" noChangeAspect="1"/>
+            </wp:cNvGraphicFramePr>
+            <a:graphic xmlns:a="http://schemas.openxmlformats.org/drawingml/2006/main">
+              <a:graphicData uri="http://schemas.openxmlformats.org/drawingml/2006/picture">
+                <pic:pic xmlns:pic="http://schemas.openxmlformats.org/drawingml/2006/picture">
+                  <pic:nvPicPr>
+                    <pic:cNvPr id="1940641889" name="Imagen 1" descr="Interfaz de usuario gráfica, Aplicación&#10;&#10;El contenido generado por IA puede ser incorrecto."/>
+                    <pic:cNvPicPr/>
+                  </pic:nvPicPr>
+                  <pic:blipFill>
+                    <a:blip r:embed="rId8"/>
+                    <a:stretch>
+                      <a:fillRect/>
+                    </a:stretch>
+                  </pic:blipFill>
+                  <pic:spPr>
+                    <a:xfrm>
+                      <a:off x="0" y="0"/>
+                      <a:ext cx="5612130" cy="3156585"/>
+                    </a:xfrm>
+                    <a:prstGeom prst="rect">
+                      <a:avLst/>
+                    </a:prstGeom>
+                  </pic:spPr>
+                </pic:pic>
+              </a:graphicData>
+            </a:graphic>
+          </wp:inline>
+        </w:drawing>
+      </w:r>
+    </w:p>
+    <w:p>
+      <w:pPr>
+        <w:spacing w:line="276" w:lineRule="auto"/>
+        <w:rPr>
+          <w:rFonts w:ascii="Times New Roman" w:hAnsi="Times New Roman" w:cs="Times New Roman"/>
+          <w:b/>
+          <w:bCs/>
+        </w:rPr>
+      </w:pPr>
+    </w:p>
+    <w:p>
+      <w:pPr>
+        <w:spacing w:line="276" w:lineRule="auto"/>
+        <w:rPr>
+          <w:rFonts w:ascii="Times New Roman" w:hAnsi="Times New Roman" w:cs="Times New Roman"/>
+          <w:b/>
+          <w:bCs/>
+        </w:rPr>
+      </w:pPr>
+    </w:p>
+    <w:p>
+      <w:pPr>
+        <w:spacing w:line="276" w:lineRule="auto"/>
+        <w:rPr>
+          <w:rFonts w:ascii="Times New Roman" w:hAnsi="Times New Roman" w:cs="Times New Roman"/>
+          <w:b/>
+          <w:bCs/>
+        </w:rPr>
+      </w:pPr>
+    </w:p>
+    <w:p>
+      <w:pPr>
+        <w:pStyle w:val="Prrafodelista"/>
+        <w:numPr>
+          <w:ilvl w:val="0"/>
+          <w:numId w:val="16"/>
+        </w:numPr>
+        <w:spacing w:line="276" w:lineRule="auto"/>
+        <w:rPr>
+          <w:rFonts w:ascii="Times New Roman" w:hAnsi="Times New Roman" w:cs="Times New Roman"/>
+          <w:b/>
+          <w:bCs/>
+        </w:rPr>
+      </w:pPr>
+      <w:r>
+        <w:rPr>
+          <w:rFonts w:ascii="Times New Roman" w:hAnsi="Times New Roman" w:cs="Times New Roman"/>
+          <w:b/>
+          <w:bCs/>
+        </w:rPr>
+        <w:lastRenderedPageBreak/>
+        <w:t>Entradas</w:t>
+      </w:r>
+      <w:r>
+        <w:rPr>
+          <w:rFonts w:ascii="Times New Roman" w:hAnsi="Times New Roman" w:cs="Times New Roman"/>
+          <w:b/>
+          <w:bCs/>
+        </w:rPr>
+        <w:t>/Salidas</w:t>
+      </w:r>
+    </w:p>
+    <w:p>
+      <w:pPr>
+        <w:spacing w:line="276" w:lineRule="auto"/>
+        <w:rPr>
+          <w:rFonts w:ascii="Times New Roman" w:hAnsi="Times New Roman" w:cs="Times New Roman"/>
+          <w:b/>
+          <w:bCs/>
+        </w:rPr>
+      </w:pPr>
+      <w:r>
+        <w:rPr>
+          <w:rFonts w:ascii="Times New Roman" w:hAnsi="Times New Roman" w:cs="Times New Roman"/>
+          <w:b/>
+          <w:bCs/>
+        </w:rPr>
+        <w:drawing>
+          <wp:inline distT="0" distB="0" distL="0" distR="0" wp14:anchorId="0264D1A0" wp14:editId="1E79B17E">
+            <wp:extent cx="5612130" cy="3156585"/>
+            <wp:effectExtent l="0" t="0" r="7620" b="5715"/>
+            <wp:docPr id="2073325442" name="Imagen 1" descr="Captura de pantalla de computadora&#10;&#10;El contenido generado por IA puede ser incorrecto."/>
+            <wp:cNvGraphicFramePr>
+              <a:graphicFrameLocks xmlns:a="http://schemas.openxmlformats.org/drawingml/2006/main" noChangeAspect="1"/>
+            </wp:cNvGraphicFramePr>
+            <a:graphic xmlns:a="http://schemas.openxmlformats.org/drawingml/2006/main">
+              <a:graphicData uri="http://schemas.openxmlformats.org/drawingml/2006/picture">
+                <pic:pic xmlns:pic="http://schemas.openxmlformats.org/drawingml/2006/picture">
+                  <pic:nvPicPr>
+                    <pic:cNvPr id="2073325442" name="Imagen 1" descr="Captura de pantalla de computadora&#10;&#10;El contenido generado por IA puede ser incorrecto."/>
+                    <pic:cNvPicPr/>
+                  </pic:nvPicPr>
+                  <pic:blipFill>
+                    <a:blip r:embed="rId9"/>
+                    <a:stretch>
+                      <a:fillRect/>
+                    </a:stretch>
+                  </pic:blipFill>
+                  <pic:spPr>
+                    <a:xfrm>
+                      <a:off x="0" y="0"/>
+                      <a:ext cx="5612130" cy="3156585"/>
+                    </a:xfrm>
+                    <a:prstGeom prst="rect">
+                      <a:avLst/>
+                    </a:prstGeom>
+                  </pic:spPr>
+                </pic:pic>
+              </a:graphicData>
+            </a:graphic>
+          </wp:inline>
+        </w:drawing>
+      </w:r>
+    </w:p>
+    <w:p>
+      <w:pPr>
+        <w:pStyle w:val="Prrafodelista"/>
+        <w:numPr>
+          <w:ilvl w:val="0"/>
+          <w:numId w:val="16"/>
+        </w:numPr>
+        <w:spacing w:line="276" w:lineRule="auto"/>
+        <w:rPr>
+          <w:rFonts w:ascii="Times New Roman" w:hAnsi="Times New Roman" w:cs="Times New Roman"/>
+          <w:b/>
+          <w:bCs/>
+        </w:rPr>
+      </w:pPr>
+      <w:r>
+        <w:rPr>
+          <w:rFonts w:ascii="Times New Roman" w:hAnsi="Times New Roman" w:cs="Times New Roman"/>
+          <w:b/>
+          <w:bCs/>
+        </w:rPr>
+        <w:t>Usuario</w:t>
+      </w:r>
+    </w:p>
+    <w:p>
+      <w:pPr>
+        <w:spacing w:line="276" w:lineRule="auto"/>
+        <w:rPr>
+          <w:rFonts w:ascii="Times New Roman" w:hAnsi="Times New Roman" w:cs="Times New Roman"/>
+          <w:b/>
+          <w:bCs/>
+        </w:rPr>
+      </w:pPr>
+      <w:r>
+        <w:rPr>
+          <w:rFonts w:ascii="Times New Roman" w:hAnsi="Times New Roman" w:cs="Times New Roman"/>
+          <w:b/>
+          <w:bCs/>
+        </w:rPr>
+        <w:drawing>
+          <wp:inline distT="0" distB="0" distL="0" distR="0" wp14:anchorId="0F930519" wp14:editId="2AFB9AF2">
+            <wp:extent cx="5612130" cy="3156585"/>
+            <wp:effectExtent l="0" t="0" r="7620" b="5715"/>
+            <wp:docPr id="978279868" name="Imagen 1" descr="Interfaz de usuario gráfica, Texto, Aplicación, Correo electrónico&#10;&#10;El contenido generado por IA puede ser incorrecto."/>
+            <wp:cNvGraphicFramePr>
+              <a:graphicFrameLocks xmlns:a="http://schemas.openxmlformats.org/drawingml/2006/main" noChangeAspect="1"/>
+            </wp:cNvGraphicFramePr>
+            <a:graphic xmlns:a="http://schemas.openxmlformats.org/drawingml/2006/main">
+              <a:graphicData uri="http://schemas.openxmlformats.org/drawingml/2006/picture">
+                <pic:pic xmlns:pic="http://schemas.openxmlformats.org/drawingml/2006/picture">
+                  <pic:nvPicPr>
+                    <pic:cNvPr id="978279868" name="Imagen 1" descr="Interfaz de usuario gráfica, Texto, Aplicación, Correo electrónico&#10;&#10;El contenido generado por IA puede ser incorrecto."/>
+                    <pic:cNvPicPr/>
+                  </pic:nvPicPr>
+                  <pic:blipFill>
+                    <a:blip r:embed="rId10"/>
+                    <a:stretch>
+                      <a:fillRect/>
+                    </a:stretch>
+                  </pic:blipFill>
+                  <pic:spPr>
+                    <a:xfrm>
+                      <a:off x="0" y="0"/>
+                      <a:ext cx="5612130" cy="3156585"/>
+                    </a:xfrm>
+                    <a:prstGeom prst="rect">
+                      <a:avLst/>
+                    </a:prstGeom>
+                  </pic:spPr>
+                </pic:pic>
+              </a:graphicData>
+            </a:graphic>
+          </wp:inline>
+        </w:drawing>
+      </w:r>
+    </w:p>
+    <w:p>
+      <w:pPr>
+        <w:spacing w:line="276" w:lineRule="auto"/>
+        <w:rPr>
+          <w:rFonts w:ascii="Times New Roman" w:hAnsi="Times New Roman" w:cs="Times New Roman"/>
+          <w:b/>
+          <w:bCs/>
+        </w:rPr>
+      </w:pPr>
+    </w:p>
+    <w:p>
+      <w:pPr>
+        <w:spacing w:line="276" w:lineRule="auto"/>
+        <w:rPr>
+          <w:rFonts w:ascii="Times New Roman" w:hAnsi="Times New Roman" w:cs="Times New Roman"/>
+          <w:b/>
+          <w:bCs/>
+        </w:rPr>
+      </w:pPr>
+    </w:p>
+    <w:p>
+      <w:pPr>
+        <w:spacing w:line="276" w:lineRule="auto"/>
+        <w:rPr>
+          <w:rFonts w:ascii="Times New Roman" w:hAnsi="Times New Roman" w:cs="Times New Roman"/>
+          <w:b/>
+          <w:bCs/>
+        </w:rPr>
+      </w:pPr>
+    </w:p>
+    <w:p>
+      <w:pPr>
+        <w:pStyle w:val="Prrafodelista"/>
+        <w:numPr>
+          <w:ilvl w:val="0"/>
+          <w:numId w:val="16"/>
+        </w:numPr>
+        <w:spacing w:line="276" w:lineRule="auto"/>
+        <w:rPr>
+          <w:rFonts w:ascii="Times New Roman" w:hAnsi="Times New Roman" w:cs="Times New Roman"/>
+          <w:b/>
+          <w:bCs/>
+        </w:rPr>
+      </w:pPr>
+      <w:proofErr w:type="spellStart"/>
+      <w:r>
+        <w:rPr>
+          <w:rFonts w:ascii="Times New Roman" w:hAnsi="Times New Roman" w:cs="Times New Roman"/>
+          <w:b/>
+          <w:bCs/>
+        </w:rPr>
+        <w:lastRenderedPageBreak/>
+        <w:t>Dashboard</w:t>
+      </w:r>
+      <w:proofErr w:type="spellEnd"/>
+      <w:r>
+        <w:rPr>
+          <w:rFonts w:ascii="Times New Roman" w:hAnsi="Times New Roman" w:cs="Times New Roman"/>
+          <w:b/>
+          <w:bCs/>
+        </w:rPr>
+        <w:t xml:space="preserve"> </w:t>
+      </w:r>
+      <w:r>
+        <w:rPr>
+          <w:rFonts w:ascii="Times New Roman" w:hAnsi="Times New Roman" w:cs="Times New Roman"/>
+          <w:b/>
+          <w:bCs/>
+        </w:rPr>
+        <w:t>–</w:t>
+      </w:r>
+      <w:r>
+        <w:rPr>
+          <w:rFonts w:ascii="Times New Roman" w:hAnsi="Times New Roman" w:cs="Times New Roman"/>
+          <w:b/>
+          <w:bCs/>
+        </w:rPr>
+        <w:t xml:space="preserve"> Empleado</w:t>
+      </w:r>
+    </w:p>
+    <w:p>
+      <w:pPr>
+        <w:spacing w:line="276" w:lineRule="auto"/>
+        <w:rPr>
+          <w:rFonts w:ascii="Times New Roman" w:hAnsi="Times New Roman" w:cs="Times New Roman"/>
+          <w:b/>
+          <w:bCs/>
+        </w:rPr>
+      </w:pPr>
+      <w:r>
+        <w:rPr>
+          <w:rFonts w:ascii="Times New Roman" w:hAnsi="Times New Roman" w:cs="Times New Roman"/>
+          <w:b/>
+          <w:bCs/>
+        </w:rPr>
+        <w:drawing>
+          <wp:inline distT="0" distB="0" distL="0" distR="0" wp14:anchorId="36D8D994" wp14:editId="14D66757">
+            <wp:extent cx="5612130" cy="3156585"/>
+            <wp:effectExtent l="0" t="0" r="7620" b="5715"/>
+            <wp:docPr id="217036084" name="Imagen 1" descr="Interfaz de usuario gráfica, Aplicación, Correo electrónico&#10;&#10;El contenido generado por IA puede ser incorrecto."/>
+            <wp:cNvGraphicFramePr>
+              <a:graphicFrameLocks xmlns:a="http://schemas.openxmlformats.org/drawingml/2006/main" noChangeAspect="1"/>
+            </wp:cNvGraphicFramePr>
+            <a:graphic xmlns:a="http://schemas.openxmlformats.org/drawingml/2006/main">
+              <a:graphicData uri="http://schemas.openxmlformats.org/drawingml/2006/picture">
+                <pic:pic xmlns:pic="http://schemas.openxmlformats.org/drawingml/2006/picture">
+                  <pic:nvPicPr>
+                    <pic:cNvPr id="217036084" name="Imagen 1" descr="Interfaz de usuario gráfica, Aplicación, Correo electrónico&#10;&#10;El contenido generado por IA puede ser incorrecto."/>
+                    <pic:cNvPicPr/>
+                  </pic:nvPicPr>
+                  <pic:blipFill>
+                    <a:blip r:embed="rId11"/>
+                    <a:stretch>
+                      <a:fillRect/>
+                    </a:stretch>
+                  </pic:blipFill>
+                  <pic:spPr>
+                    <a:xfrm>
+                      <a:off x="0" y="0"/>
+                      <a:ext cx="5612130" cy="3156585"/>
+                    </a:xfrm>
+                    <a:prstGeom prst="rect">
+                      <a:avLst/>
+                    </a:prstGeom>
+                  </pic:spPr>
+                </pic:pic>
+              </a:graphicData>
+            </a:graphic>
+          </wp:inline>
+        </w:drawing>
+      </w:r>
+    </w:p>
+    <w:p>
+      <w:pPr>
+        <w:pStyle w:val="Prrafodelista"/>
+        <w:numPr>
+          <w:ilvl w:val="0"/>
+          <w:numId w:val="16"/>
+        </w:numPr>
+        <w:spacing w:line="276" w:lineRule="auto"/>
+        <w:rPr>
+          <w:rFonts w:ascii="Times New Roman" w:hAnsi="Times New Roman" w:cs="Times New Roman"/>
+          <w:b/>
+          <w:bCs/>
+        </w:rPr>
+      </w:pPr>
+      <w:r>
+        <w:rPr>
+          <w:rFonts w:ascii="Times New Roman" w:hAnsi="Times New Roman" w:cs="Times New Roman"/>
+          <w:b/>
+          <w:bCs/>
+        </w:rPr>
+        <w:t>Inventario</w:t>
+      </w:r>
+    </w:p>
+    <w:p>
+      <w:pPr>
+        <w:spacing w:line="276" w:lineRule="auto"/>
+        <w:rPr>
+          <w:rFonts w:ascii="Times New Roman" w:hAnsi="Times New Roman" w:cs="Times New Roman"/>
+          <w:b/>
+          <w:bCs/>
+        </w:rPr>
+      </w:pPr>
+      <w:r>
+        <w:rPr>
+          <w:rFonts w:ascii="Times New Roman" w:hAnsi="Times New Roman" w:cs="Times New Roman"/>
+          <w:b/>
+          <w:bCs/>
+        </w:rPr>
+        <w:drawing>
+          <wp:inline distT="0" distB="0" distL="0" distR="0" wp14:anchorId="487EFF95" wp14:editId="48926D2F">
+            <wp:extent cx="5612130" cy="3156585"/>
+            <wp:effectExtent l="0" t="0" r="7620" b="5715"/>
+            <wp:docPr id="1670595857" name="Imagen 1" descr="Interfaz de usuario gráfica, Aplicación&#10;&#10;El contenido generado por IA puede ser incorrecto."/>
+            <wp:cNvGraphicFramePr>
+              <a:graphicFrameLocks xmlns:a="http://schemas.openxmlformats.org/drawingml/2006/main" noChangeAspect="1"/>
+            </wp:cNvGraphicFramePr>
+            <a:graphic xmlns:a="http://schemas.openxmlformats.org/drawingml/2006/main">
+              <a:graphicData uri="http://schemas.openxmlformats.org/drawingml/2006/picture">
+                <pic:pic xmlns:pic="http://schemas.openxmlformats.org/drawingml/2006/picture">
+                  <pic:nvPicPr>
+                    <pic:cNvPr id="1670595857" name="Imagen 1" descr="Interfaz de usuario gráfica, Aplicación&#10;&#10;El contenido generado por IA puede ser incorrecto."/>
+                    <pic:cNvPicPr/>
+                  </pic:nvPicPr>
+                  <pic:blipFill>
+                    <a:blip r:embed="rId12"/>
+                    <a:stretch>
+                      <a:fillRect/>
+                    </a:stretch>
+                  </pic:blipFill>
+                  <pic:spPr>
+                    <a:xfrm>
+                      <a:off x="0" y="0"/>
+                      <a:ext cx="5612130" cy="3156585"/>
+                    </a:xfrm>
+                    <a:prstGeom prst="rect">
+                      <a:avLst/>
+                    </a:prstGeom>
+                  </pic:spPr>
+                </pic:pic>
+              </a:graphicData>
+            </a:graphic>
+          </wp:inline>
+        </w:drawing>
+      </w:r>
+    </w:p>
+    <w:p>
+      <w:pPr>
+        <w:spacing w:line="276" w:lineRule="auto"/>
+        <w:rPr>
+          <w:rFonts w:ascii="Times New Roman" w:hAnsi="Times New Roman" w:cs="Times New Roman"/>
+          <w:b/>
+          <w:bCs/>
+        </w:rPr>
+      </w:pPr>
+    </w:p>
+    <w:p>
+      <w:pPr>
+        <w:spacing w:line="276" w:lineRule="auto"/>
+        <w:rPr>
+          <w:rFonts w:ascii="Times New Roman" w:hAnsi="Times New Roman" w:cs="Times New Roman"/>
+          <w:b/>
+          <w:bCs/>
+        </w:rPr>
+      </w:pPr>
+    </w:p>
+    <w:p>
+      <w:pPr>
+        <w:spacing w:line="276" w:lineRule="auto"/>
+        <w:rPr>
+          <w:rFonts w:ascii="Times New Roman" w:hAnsi="Times New Roman" w:cs="Times New Roman"/>
+          <w:b/>
+          <w:bCs/>
+        </w:rPr>
+      </w:pPr>
+    </w:p>
+    <w:p>
+      <w:pPr>
+        <w:pStyle w:val="Prrafodelista"/>
+        <w:numPr>
+          <w:ilvl w:val="0"/>
+          <w:numId w:val="16"/>
+        </w:numPr>
+        <w:spacing w:line="276" w:lineRule="auto"/>
+        <w:rPr>
+          <w:rFonts w:ascii="Times New Roman" w:hAnsi="Times New Roman" w:cs="Times New Roman"/>
+          <w:b/>
+          <w:bCs/>
+        </w:rPr>
+      </w:pPr>
+      <w:r>
+        <w:rPr>
+          <w:rFonts w:ascii="Times New Roman" w:hAnsi="Times New Roman" w:cs="Times New Roman"/>
+          <w:b/>
+          <w:bCs/>
+        </w:rPr>
+        <w:lastRenderedPageBreak/>
+        <w:t>Entradas/Salidas</w:t>
+      </w:r>
+    </w:p>
+    <w:p>
+      <w:pPr>
+        <w:spacing w:line="276" w:lineRule="auto"/>
+        <w:rPr>
+          <w:rFonts w:ascii="Times New Roman" w:hAnsi="Times New Roman" w:cs="Times New Roman"/>
+          <w:b/>
+          <w:bCs/>
+        </w:rPr>
+      </w:pPr>
+      <w:r>
+        <w:rPr>
+          <w:rFonts w:ascii="Times New Roman" w:hAnsi="Times New Roman" w:cs="Times New Roman"/>
+          <w:b/>
+          <w:bCs/>
+        </w:rPr>
+        <w:drawing>
+          <wp:inline distT="0" distB="0" distL="0" distR="0" wp14:anchorId="27415613" wp14:editId="035675E2">
+            <wp:extent cx="5612130" cy="3156585"/>
+            <wp:effectExtent l="0" t="0" r="7620" b="5715"/>
+            <wp:docPr id="1573685197" name="Imagen 1" descr="Captura de pantalla de computadora&#10;&#10;El contenido generado por IA puede ser incorrecto."/>
+            <wp:cNvGraphicFramePr>
+              <a:graphicFrameLocks xmlns:a="http://schemas.openxmlformats.org/drawingml/2006/main" noChangeAspect="1"/>
+            </wp:cNvGraphicFramePr>
+            <a:graphic xmlns:a="http://schemas.openxmlformats.org/drawingml/2006/main">
+              <a:graphicData uri="http://schemas.openxmlformats.org/drawingml/2006/picture">
+                <pic:pic xmlns:pic="http://schemas.openxmlformats.org/drawingml/2006/picture">
+                  <pic:nvPicPr>
+                    <pic:cNvPr id="1573685197" name="Imagen 1" descr="Captura de pantalla de computadora&#10;&#10;El contenido generado por IA puede ser incorrecto."/>
+                    <pic:cNvPicPr/>
+                  </pic:nvPicPr>
+                  <pic:blipFill>
+                    <a:blip r:embed="rId13"/>
+                    <a:stretch>
+                      <a:fillRect/>
+                    </a:stretch>
+                  </pic:blipFill>
+                  <pic:spPr>
+                    <a:xfrm>
+                      <a:off x="0" y="0"/>
+                      <a:ext cx="5612130" cy="3156585"/>
+                    </a:xfrm>
+                    <a:prstGeom prst="rect">
+                      <a:avLst/>
+                    </a:prstGeom>
+                  </pic:spPr>
+                </pic:pic>
+              </a:graphicData>
+            </a:graphic>
+          </wp:inline>
+        </w:drawing>
+      </w:r>
+    </w:p>
+    <w:p>
+      <w:pPr>
+        <w:spacing w:line="276" w:lineRule="auto"/>
+        <w:rPr>
+          <w:rFonts w:ascii="Times New Roman" w:hAnsi="Times New Roman" w:cs="Times New Roman"/>
+          <w:b/>
+          <w:bCs/>
+        </w:rPr>
+      </w:pPr>
+      <w:r>
+        <w:rPr>
+          <w:rFonts w:ascii="Times New Roman" w:hAnsi="Times New Roman" w:cs="Times New Roman"/>
+          <w:b/>
+          <w:bCs/>
+        </w:rPr>
         <w:t>Preguntas para Evaluar la Necesidad de la Empresa</w:t>
       </w:r>
     </w:p>
@@ -442,6 +1978,161 @@
     <w:p>
       <w:pPr>
         <w:pStyle w:val="Prrafodelista"/>
+        <w:spacing w:line="276" w:lineRule="auto"/>
+        <w:ind w:left="1080"/>
+        <w:rPr>
+          <w:rFonts w:ascii="Times New Roman" w:hAnsi="Times New Roman" w:cs="Times New Roman"/>
+        </w:rPr>
+      </w:pPr>
+      <w:r>
+        <w:rPr>
+          <w:rFonts w:ascii="Times New Roman" w:hAnsi="Times New Roman" w:cs="Times New Roman"/>
+        </w:rPr>
+        <w:t>El sistema debe contar con los siguientes tipos de usuarios:</w:t>
+      </w:r>
+    </w:p>
+    <w:p>
+      <w:pPr>
+        <w:pStyle w:val="Prrafodelista"/>
+        <w:numPr>
+          <w:ilvl w:val="0"/>
+          <w:numId w:val="7"/>
+        </w:numPr>
+        <w:spacing w:line="276" w:lineRule="auto"/>
+        <w:rPr>
+          <w:rFonts w:ascii="Times New Roman" w:hAnsi="Times New Roman" w:cs="Times New Roman"/>
+        </w:rPr>
+      </w:pPr>
+      <w:r>
+        <w:rPr>
+          <w:rFonts w:ascii="Times New Roman" w:hAnsi="Times New Roman" w:cs="Times New Roman"/>
+          <w:b/>
+          <w:bCs/>
+        </w:rPr>
+        <w:t>Administrador:</w:t>
+      </w:r>
+      <w:r>
+        <w:rPr>
+          <w:rFonts w:ascii="Times New Roman" w:hAnsi="Times New Roman" w:cs="Times New Roman"/>
+        </w:rPr>
+        <w:t xml:space="preserve"> </w:t>
+      </w:r>
+      <w:r>
+        <w:rPr>
+          <w:rFonts w:ascii="Times New Roman" w:hAnsi="Times New Roman" w:cs="Times New Roman"/>
+        </w:rPr>
+        <w:t>debe tener acceso completo al sistema</w:t>
+      </w:r>
+      <w:r>
+        <w:rPr>
+          <w:rFonts w:ascii="Times New Roman" w:hAnsi="Times New Roman" w:cs="Times New Roman"/>
+        </w:rPr>
+        <w:t xml:space="preserve">, </w:t>
+      </w:r>
+      <w:r>
+        <w:rPr>
+          <w:rFonts w:ascii="Times New Roman" w:hAnsi="Times New Roman" w:cs="Times New Roman"/>
+        </w:rPr>
+        <w:t>debe poder</w:t>
+      </w:r>
+      <w:r>
+        <w:rPr>
+          <w:rFonts w:ascii="Times New Roman" w:hAnsi="Times New Roman" w:cs="Times New Roman"/>
+        </w:rPr>
+        <w:t xml:space="preserve"> gestionar usuarios, productos, movimientos y generar reportes.</w:t>
+      </w:r>
+    </w:p>
+    <w:p>
+      <w:pPr>
+        <w:pStyle w:val="Prrafodelista"/>
+        <w:numPr>
+          <w:ilvl w:val="0"/>
+          <w:numId w:val="7"/>
+        </w:numPr>
+        <w:spacing w:line="276" w:lineRule="auto"/>
+        <w:rPr>
+          <w:rFonts w:ascii="Times New Roman" w:hAnsi="Times New Roman" w:cs="Times New Roman"/>
+        </w:rPr>
+      </w:pPr>
+      <w:r>
+        <w:rPr>
+          <w:rFonts w:ascii="Times New Roman" w:hAnsi="Times New Roman" w:cs="Times New Roman"/>
+          <w:b/>
+          <w:bCs/>
+        </w:rPr>
+        <w:t>Empleado:</w:t>
+      </w:r>
+      <w:r>
+        <w:rPr>
+          <w:rFonts w:ascii="Times New Roman" w:hAnsi="Times New Roman" w:cs="Times New Roman"/>
+        </w:rPr>
+        <w:t xml:space="preserve"> </w:t>
+      </w:r>
+      <w:r>
+        <w:rPr>
+          <w:rFonts w:ascii="Times New Roman" w:hAnsi="Times New Roman" w:cs="Times New Roman"/>
+        </w:rPr>
+        <w:t xml:space="preserve">debe poder </w:t>
+      </w:r>
+      <w:r>
+        <w:rPr>
+          <w:rFonts w:ascii="Times New Roman" w:hAnsi="Times New Roman" w:cs="Times New Roman"/>
+        </w:rPr>
+        <w:t>registrar entradas y salidas de inventario y consultar información, pero no administrar usuarios.</w:t>
+      </w:r>
+    </w:p>
+    <w:p>
+      <w:pPr>
+        <w:pStyle w:val="Prrafodelista"/>
+        <w:numPr>
+          <w:ilvl w:val="0"/>
+          <w:numId w:val="7"/>
+        </w:numPr>
+        <w:spacing w:line="276" w:lineRule="auto"/>
+        <w:rPr>
+          <w:rFonts w:ascii="Times New Roman" w:hAnsi="Times New Roman" w:cs="Times New Roman"/>
+        </w:rPr>
+      </w:pPr>
+      <w:r>
+        <w:rPr>
+          <w:rFonts w:ascii="Times New Roman" w:hAnsi="Times New Roman" w:cs="Times New Roman"/>
+          <w:b/>
+          <w:bCs/>
+        </w:rPr>
+        <w:t>(Opcional) Cliente:</w:t>
+      </w:r>
+      <w:r>
+        <w:rPr>
+          <w:rFonts w:ascii="Times New Roman" w:hAnsi="Times New Roman" w:cs="Times New Roman"/>
+        </w:rPr>
+        <w:t xml:space="preserve"> solo </w:t>
+      </w:r>
+      <w:r>
+        <w:rPr>
+          <w:rFonts w:ascii="Times New Roman" w:hAnsi="Times New Roman" w:cs="Times New Roman"/>
+        </w:rPr>
+        <w:t>debe tener</w:t>
+      </w:r>
+      <w:r>
+        <w:rPr>
+          <w:rFonts w:ascii="Times New Roman" w:hAnsi="Times New Roman" w:cs="Times New Roman"/>
+        </w:rPr>
+        <w:t xml:space="preserve"> permisos de consulta si la empresa decide habilitar acceso externo.</w:t>
+      </w:r>
+    </w:p>
+    <w:p>
+      <w:pPr>
+        <w:pStyle w:val="Prrafodelista"/>
+        <w:spacing w:line="276" w:lineRule="auto"/>
+        <w:ind w:left="1080"/>
+        <w:rPr>
+          <w:rFonts w:ascii="Times New Roman" w:hAnsi="Times New Roman" w:cs="Times New Roman"/>
+        </w:rPr>
+      </w:pPr>
+    </w:p>
+    <w:p>
+      <w:pPr>
+        <w:pStyle w:val="Prrafodelista"/>
         <w:numPr>
           <w:ilvl w:val="0"/>
           <w:numId w:val="4"/>
@@ -473,6 +2164,129 @@
     <w:p>
       <w:pPr>
         <w:pStyle w:val="Prrafodelista"/>
+        <w:spacing w:line="276" w:lineRule="auto"/>
+        <w:ind w:left="1080"/>
+        <w:rPr>
+          <w:rFonts w:ascii="Times New Roman" w:hAnsi="Times New Roman" w:cs="Times New Roman"/>
+        </w:rPr>
+      </w:pPr>
+      <w:r>
+        <w:rPr>
+          <w:rFonts w:ascii="Times New Roman" w:hAnsi="Times New Roman" w:cs="Times New Roman"/>
+        </w:rPr>
+        <w:t>El sistema debe permitir registrar:</w:t>
+      </w:r>
+    </w:p>
+    <w:p>
+      <w:pPr>
+        <w:pStyle w:val="Prrafodelista"/>
+        <w:numPr>
+          <w:ilvl w:val="0"/>
+          <w:numId w:val="7"/>
+        </w:numPr>
+        <w:spacing w:line="276" w:lineRule="auto"/>
+        <w:rPr>
+          <w:rFonts w:ascii="Times New Roman" w:hAnsi="Times New Roman" w:cs="Times New Roman"/>
+        </w:rPr>
+      </w:pPr>
+      <w:r>
+        <w:rPr>
+          <w:rFonts w:ascii="Times New Roman" w:hAnsi="Times New Roman" w:cs="Times New Roman"/>
+          <w:b/>
+          <w:bCs/>
+        </w:rPr>
+        <w:t>Entradas:</w:t>
+      </w:r>
+      <w:r>
+        <w:rPr>
+          <w:rFonts w:ascii="Times New Roman" w:hAnsi="Times New Roman" w:cs="Times New Roman"/>
+        </w:rPr>
+        <w:t xml:space="preserve"> ingreso de nuevos productos al inventario.</w:t>
+      </w:r>
+    </w:p>
+    <w:p>
+      <w:pPr>
+        <w:pStyle w:val="Prrafodelista"/>
+        <w:numPr>
+          <w:ilvl w:val="0"/>
+          <w:numId w:val="7"/>
+        </w:numPr>
+        <w:spacing w:line="276" w:lineRule="auto"/>
+        <w:rPr>
+          <w:rFonts w:ascii="Times New Roman" w:hAnsi="Times New Roman" w:cs="Times New Roman"/>
+        </w:rPr>
+      </w:pPr>
+      <w:r>
+        <w:rPr>
+          <w:rFonts w:ascii="Times New Roman" w:hAnsi="Times New Roman" w:cs="Times New Roman"/>
+          <w:b/>
+          <w:bCs/>
+        </w:rPr>
+        <w:t>Salidas:</w:t>
+      </w:r>
+      <w:r>
+        <w:rPr>
+          <w:rFonts w:ascii="Times New Roman" w:hAnsi="Times New Roman" w:cs="Times New Roman"/>
+        </w:rPr>
+        <w:t xml:space="preserve"> despacho o venta de productos.</w:t>
+      </w:r>
+    </w:p>
+    <w:p>
+      <w:pPr>
+        <w:pStyle w:val="Prrafodelista"/>
+        <w:numPr>
+          <w:ilvl w:val="0"/>
+          <w:numId w:val="7"/>
+        </w:numPr>
+        <w:spacing w:line="276" w:lineRule="auto"/>
+        <w:rPr>
+          <w:rFonts w:ascii="Times New Roman" w:hAnsi="Times New Roman" w:cs="Times New Roman"/>
+        </w:rPr>
+      </w:pPr>
+      <w:r>
+        <w:rPr>
+          <w:rFonts w:ascii="Times New Roman" w:hAnsi="Times New Roman" w:cs="Times New Roman"/>
+          <w:b/>
+          <w:bCs/>
+        </w:rPr>
+        <w:t>Devoluciones:</w:t>
+      </w:r>
+      <w:r>
+        <w:rPr>
+          <w:rFonts w:ascii="Times New Roman" w:hAnsi="Times New Roman" w:cs="Times New Roman"/>
+        </w:rPr>
+        <w:t xml:space="preserve"> productos retornados al inventario.</w:t>
+      </w:r>
+    </w:p>
+    <w:p>
+      <w:pPr>
+        <w:pStyle w:val="Prrafodelista"/>
+        <w:spacing w:line="276" w:lineRule="auto"/>
+        <w:ind w:left="1080"/>
+        <w:rPr>
+          <w:rFonts w:ascii="Times New Roman" w:hAnsi="Times New Roman" w:cs="Times New Roman"/>
+        </w:rPr>
+      </w:pPr>
+      <w:r>
+        <w:rPr>
+          <w:rFonts w:ascii="Times New Roman" w:hAnsi="Times New Roman" w:cs="Times New Roman"/>
+        </w:rPr>
+        <w:t>Cada movimiento debe almacenar: producto, cantidad, fecha y usuario responsable.</w:t>
+      </w:r>
+    </w:p>
+    <w:p>
+      <w:pPr>
+        <w:pStyle w:val="Prrafodelista"/>
+        <w:spacing w:line="276" w:lineRule="auto"/>
+        <w:ind w:left="1080"/>
+        <w:rPr>
+          <w:rFonts w:ascii="Times New Roman" w:hAnsi="Times New Roman" w:cs="Times New Roman"/>
+        </w:rPr>
+      </w:pPr>
+    </w:p>
+    <w:p>
+      <w:pPr>
+        <w:pStyle w:val="Prrafodelista"/>
         <w:numPr>
           <w:ilvl w:val="0"/>
           <w:numId w:val="4"/>
@@ -492,6 +2306,149 @@
     <w:p>
       <w:pPr>
         <w:pStyle w:val="Prrafodelista"/>
+        <w:spacing w:line="276" w:lineRule="auto"/>
+        <w:ind w:left="1080"/>
+        <w:rPr>
+          <w:rFonts w:ascii="Times New Roman" w:hAnsi="Times New Roman" w:cs="Times New Roman"/>
+        </w:rPr>
+      </w:pPr>
+      <w:r>
+        <w:rPr>
+          <w:rFonts w:ascii="Times New Roman" w:hAnsi="Times New Roman" w:cs="Times New Roman"/>
+        </w:rPr>
+        <w:lastRenderedPageBreak/>
+        <w:t>Sí</w:t>
+      </w:r>
+      <w:r>
+        <w:rPr>
+          <w:rFonts w:ascii="Times New Roman" w:hAnsi="Times New Roman" w:cs="Times New Roman"/>
+        </w:rPr>
+        <w:t>, e</w:t>
+      </w:r>
+      <w:r>
+        <w:rPr>
+          <w:rFonts w:ascii="Times New Roman" w:hAnsi="Times New Roman" w:cs="Times New Roman"/>
+        </w:rPr>
+        <w:t>l sistema debe generar reportes automáticos como:</w:t>
+      </w:r>
+    </w:p>
+    <w:p>
+      <w:pPr>
+        <w:pStyle w:val="Prrafodelista"/>
+        <w:numPr>
+          <w:ilvl w:val="0"/>
+          <w:numId w:val="7"/>
+        </w:numPr>
+        <w:spacing w:line="276" w:lineRule="auto"/>
+        <w:rPr>
+          <w:rFonts w:ascii="Times New Roman" w:hAnsi="Times New Roman" w:cs="Times New Roman"/>
+        </w:rPr>
+      </w:pPr>
+      <w:r>
+        <w:rPr>
+          <w:rFonts w:ascii="Times New Roman" w:hAnsi="Times New Roman" w:cs="Times New Roman"/>
+        </w:rPr>
+        <w:t>Reporte de inventario actual.</w:t>
+      </w:r>
+    </w:p>
+    <w:p>
+      <w:pPr>
+        <w:pStyle w:val="Prrafodelista"/>
+        <w:numPr>
+          <w:ilvl w:val="0"/>
+          <w:numId w:val="7"/>
+        </w:numPr>
+        <w:spacing w:line="276" w:lineRule="auto"/>
+        <w:rPr>
+          <w:rFonts w:ascii="Times New Roman" w:hAnsi="Times New Roman" w:cs="Times New Roman"/>
+        </w:rPr>
+      </w:pPr>
+      <w:r>
+        <w:rPr>
+          <w:rFonts w:ascii="Times New Roman" w:hAnsi="Times New Roman" w:cs="Times New Roman"/>
+        </w:rPr>
+        <w:t>Reporte de movimientos por fechas</w:t>
+      </w:r>
+      <w:r>
+        <w:rPr>
+          <w:rFonts w:ascii="Times New Roman" w:hAnsi="Times New Roman" w:cs="Times New Roman"/>
+        </w:rPr>
+        <w:t xml:space="preserve"> o rango de fechas</w:t>
+      </w:r>
+      <w:r>
+        <w:rPr>
+          <w:rFonts w:ascii="Times New Roman" w:hAnsi="Times New Roman" w:cs="Times New Roman"/>
+        </w:rPr>
+        <w:t>.</w:t>
+      </w:r>
+    </w:p>
+    <w:p>
+      <w:pPr>
+        <w:pStyle w:val="Prrafodelista"/>
+        <w:numPr>
+          <w:ilvl w:val="0"/>
+          <w:numId w:val="7"/>
+        </w:numPr>
+        <w:spacing w:line="276" w:lineRule="auto"/>
+        <w:rPr>
+          <w:rFonts w:ascii="Times New Roman" w:hAnsi="Times New Roman" w:cs="Times New Roman"/>
+        </w:rPr>
+      </w:pPr>
+      <w:r>
+        <w:rPr>
+          <w:rFonts w:ascii="Times New Roman" w:hAnsi="Times New Roman" w:cs="Times New Roman"/>
+        </w:rPr>
+        <w:t>Reporte por usuario.</w:t>
+      </w:r>
+    </w:p>
+    <w:p>
+      <w:pPr>
+        <w:pStyle w:val="Prrafodelista"/>
+        <w:numPr>
+          <w:ilvl w:val="0"/>
+          <w:numId w:val="7"/>
+        </w:numPr>
+        <w:spacing w:line="276" w:lineRule="auto"/>
+        <w:rPr>
+          <w:rFonts w:ascii="Times New Roman" w:hAnsi="Times New Roman" w:cs="Times New Roman"/>
+        </w:rPr>
+      </w:pPr>
+      <w:r>
+        <w:rPr>
+          <w:rFonts w:ascii="Times New Roman" w:hAnsi="Times New Roman" w:cs="Times New Roman"/>
+        </w:rPr>
+        <w:t>Reporte de productos con bajo stock.</w:t>
+      </w:r>
+    </w:p>
+    <w:p>
+      <w:pPr>
+        <w:pStyle w:val="Prrafodelista"/>
+        <w:spacing w:line="276" w:lineRule="auto"/>
+        <w:ind w:left="1080"/>
+        <w:rPr>
+          <w:rFonts w:ascii="Times New Roman" w:hAnsi="Times New Roman" w:cs="Times New Roman"/>
+        </w:rPr>
+      </w:pPr>
+      <w:r>
+        <w:rPr>
+          <w:rFonts w:ascii="Times New Roman" w:hAnsi="Times New Roman" w:cs="Times New Roman"/>
+        </w:rPr>
+        <w:t xml:space="preserve">Esto facilita el control interno para que la empresa pueda tomar decisiones al respecto. </w:t>
+      </w:r>
+    </w:p>
+    <w:p>
+      <w:pPr>
+        <w:pStyle w:val="Prrafodelista"/>
+        <w:spacing w:line="276" w:lineRule="auto"/>
+        <w:ind w:left="1080"/>
+        <w:rPr>
+          <w:rFonts w:ascii="Times New Roman" w:hAnsi="Times New Roman" w:cs="Times New Roman"/>
+        </w:rPr>
+      </w:pPr>
+    </w:p>
+    <w:p>
+      <w:pPr>
+        <w:pStyle w:val="Prrafodelista"/>
         <w:numPr>
           <w:ilvl w:val="0"/>
           <w:numId w:val="4"/>
@@ -511,6 +2468,164 @@
     <w:p>
       <w:pPr>
         <w:pStyle w:val="Prrafodelista"/>
+        <w:spacing w:line="276" w:lineRule="auto"/>
+        <w:ind w:left="1080"/>
+        <w:rPr>
+          <w:rFonts w:ascii="Times New Roman" w:hAnsi="Times New Roman" w:cs="Times New Roman"/>
+        </w:rPr>
+      </w:pPr>
+      <w:r>
+        <w:rPr>
+          <w:rFonts w:ascii="Times New Roman" w:hAnsi="Times New Roman" w:cs="Times New Roman"/>
+        </w:rPr>
+        <w:t>La seguridad se gestionará mediante:</w:t>
+      </w:r>
+    </w:p>
+    <w:p>
+      <w:pPr>
+        <w:pStyle w:val="Prrafodelista"/>
+        <w:numPr>
+          <w:ilvl w:val="0"/>
+          <w:numId w:val="7"/>
+        </w:numPr>
+        <w:spacing w:line="276" w:lineRule="auto"/>
+        <w:rPr>
+          <w:rFonts w:ascii="Times New Roman" w:hAnsi="Times New Roman" w:cs="Times New Roman"/>
+        </w:rPr>
+      </w:pPr>
+      <w:r>
+        <w:rPr>
+          <w:rFonts w:ascii="Times New Roman" w:hAnsi="Times New Roman" w:cs="Times New Roman"/>
+        </w:rPr>
+        <w:t>Sistema de autenticación (usuario y contraseña</w:t>
+      </w:r>
+      <w:r>
+        <w:rPr>
+          <w:rFonts w:ascii="Times New Roman" w:hAnsi="Times New Roman" w:cs="Times New Roman"/>
+        </w:rPr>
+        <w:t xml:space="preserve"> y opcional validación de dos pasos</w:t>
+      </w:r>
+      <w:r>
+        <w:rPr>
+          <w:rFonts w:ascii="Times New Roman" w:hAnsi="Times New Roman" w:cs="Times New Roman"/>
+        </w:rPr>
+        <w:t>).</w:t>
+      </w:r>
+    </w:p>
+    <w:p>
+      <w:pPr>
+        <w:pStyle w:val="Prrafodelista"/>
+        <w:numPr>
+          <w:ilvl w:val="0"/>
+          <w:numId w:val="7"/>
+        </w:numPr>
+        <w:spacing w:line="276" w:lineRule="auto"/>
+        <w:rPr>
+          <w:rFonts w:ascii="Times New Roman" w:hAnsi="Times New Roman" w:cs="Times New Roman"/>
+        </w:rPr>
+      </w:pPr>
+      <w:r>
+        <w:rPr>
+          <w:rFonts w:ascii="Times New Roman" w:hAnsi="Times New Roman" w:cs="Times New Roman"/>
+        </w:rPr>
+        <w:t>Asignación de roles y permisos.</w:t>
+      </w:r>
+    </w:p>
+    <w:p>
+      <w:pPr>
+        <w:pStyle w:val="Prrafodelista"/>
+        <w:numPr>
+          <w:ilvl w:val="0"/>
+          <w:numId w:val="7"/>
+        </w:numPr>
+        <w:spacing w:line="276" w:lineRule="auto"/>
+        <w:rPr>
+          <w:rFonts w:ascii="Times New Roman" w:hAnsi="Times New Roman" w:cs="Times New Roman"/>
+        </w:rPr>
+      </w:pPr>
+      <w:r>
+        <w:rPr>
+          <w:rFonts w:ascii="Times New Roman" w:hAnsi="Times New Roman" w:cs="Times New Roman"/>
+        </w:rPr>
+        <w:t>Validación de formularios (campos obligatorios, cantidades mayores a cero, control de stock</w:t>
+      </w:r>
+      <w:r>
+        <w:rPr>
+          <w:rFonts w:ascii="Times New Roman" w:hAnsi="Times New Roman" w:cs="Times New Roman"/>
+        </w:rPr>
+        <w:t>, entre otros que puedan generar conflicto en la págin</w:t>
+      </w:r>
+      <w:r>
+        <w:rPr>
+          <w:rFonts w:ascii="Times New Roman" w:hAnsi="Times New Roman" w:cs="Times New Roman"/>
+        </w:rPr>
+        <w:t>a</w:t>
+      </w:r>
+      <w:r>
+        <w:rPr>
+          <w:rFonts w:ascii="Times New Roman" w:hAnsi="Times New Roman" w:cs="Times New Roman"/>
+        </w:rPr>
+        <w:t>).</w:t>
+      </w:r>
+    </w:p>
+    <w:p>
+      <w:pPr>
+        <w:pStyle w:val="Prrafodelista"/>
+        <w:numPr>
+          <w:ilvl w:val="0"/>
+          <w:numId w:val="7"/>
+        </w:numPr>
+        <w:spacing w:line="276" w:lineRule="auto"/>
+        <w:rPr>
+          <w:rFonts w:ascii="Times New Roman" w:hAnsi="Times New Roman" w:cs="Times New Roman"/>
+        </w:rPr>
+      </w:pPr>
+      <w:r>
+        <w:rPr>
+          <w:rFonts w:ascii="Times New Roman" w:hAnsi="Times New Roman" w:cs="Times New Roman"/>
+        </w:rPr>
+        <w:t>Restricción de acceso según tipo de usuario</w:t>
+      </w:r>
+      <w:r>
+        <w:rPr>
+          <w:rFonts w:ascii="Times New Roman" w:hAnsi="Times New Roman" w:cs="Times New Roman"/>
+        </w:rPr>
+        <w:t xml:space="preserve"> (</w:t>
+      </w:r>
+      <w:proofErr w:type="spellStart"/>
+      <w:r>
+        <w:rPr>
+          <w:rFonts w:ascii="Times New Roman" w:hAnsi="Times New Roman" w:cs="Times New Roman"/>
+        </w:rPr>
+        <w:t>Admin</w:t>
+      </w:r>
+      <w:proofErr w:type="spellEnd"/>
+      <w:r>
+        <w:rPr>
+          <w:rFonts w:ascii="Times New Roman" w:hAnsi="Times New Roman" w:cs="Times New Roman"/>
+        </w:rPr>
+        <w:t>, Empleado, Usuario/Cliente)</w:t>
+      </w:r>
+      <w:r>
+        <w:rPr>
+          <w:rFonts w:ascii="Times New Roman" w:hAnsi="Times New Roman" w:cs="Times New Roman"/>
+        </w:rPr>
+        <w:t>.</w:t>
+      </w:r>
+    </w:p>
+    <w:p>
+      <w:pPr>
+        <w:pStyle w:val="Prrafodelista"/>
+        <w:spacing w:line="276" w:lineRule="auto"/>
+        <w:ind w:left="1080"/>
+        <w:rPr>
+          <w:rFonts w:ascii="Times New Roman" w:hAnsi="Times New Roman" w:cs="Times New Roman"/>
+        </w:rPr>
+      </w:pPr>
+    </w:p>
+    <w:p>
+      <w:pPr>
+        <w:pStyle w:val="Prrafodelista"/>
         <w:numPr>
           <w:ilvl w:val="0"/>
           <w:numId w:val="4"/>
@@ -530,6 +2645,114 @@
     <w:p>
       <w:pPr>
         <w:pStyle w:val="Prrafodelista"/>
+        <w:spacing w:line="276" w:lineRule="auto"/>
+        <w:ind w:left="1080"/>
+        <w:rPr>
+          <w:rFonts w:ascii="Times New Roman" w:hAnsi="Times New Roman" w:cs="Times New Roman"/>
+        </w:rPr>
+      </w:pPr>
+      <w:r>
+        <w:rPr>
+          <w:rFonts w:ascii="Times New Roman" w:hAnsi="Times New Roman" w:cs="Times New Roman"/>
+        </w:rPr>
+        <w:t>Lo más recomendable es digitalizar lo siguiente en su respectivo orden</w:t>
+      </w:r>
+      <w:r>
+        <w:rPr>
+          <w:rFonts w:ascii="Times New Roman" w:hAnsi="Times New Roman" w:cs="Times New Roman"/>
+        </w:rPr>
+        <w:t>:</w:t>
+      </w:r>
+    </w:p>
+    <w:p>
+      <w:pPr>
+        <w:pStyle w:val="Prrafodelista"/>
+        <w:numPr>
+          <w:ilvl w:val="0"/>
+          <w:numId w:val="7"/>
+        </w:numPr>
+        <w:spacing w:line="276" w:lineRule="auto"/>
+        <w:rPr>
+          <w:rFonts w:ascii="Times New Roman" w:hAnsi="Times New Roman" w:cs="Times New Roman"/>
+        </w:rPr>
+      </w:pPr>
+      <w:r>
+        <w:rPr>
+          <w:rFonts w:ascii="Times New Roman" w:hAnsi="Times New Roman" w:cs="Times New Roman"/>
+        </w:rPr>
+        <w:t>Gestión de usuarios (para controlar accesos).</w:t>
+      </w:r>
+    </w:p>
+    <w:p>
+      <w:pPr>
+        <w:pStyle w:val="Prrafodelista"/>
+        <w:numPr>
+          <w:ilvl w:val="0"/>
+          <w:numId w:val="7"/>
+        </w:numPr>
+        <w:spacing w:line="276" w:lineRule="auto"/>
+        <w:rPr>
+          <w:rFonts w:ascii="Times New Roman" w:hAnsi="Times New Roman" w:cs="Times New Roman"/>
+        </w:rPr>
+      </w:pPr>
+      <w:r>
+        <w:rPr>
+          <w:rFonts w:ascii="Times New Roman" w:hAnsi="Times New Roman" w:cs="Times New Roman"/>
+        </w:rPr>
+        <w:t>Registro de productos.</w:t>
+      </w:r>
+    </w:p>
+    <w:p>
+      <w:pPr>
+        <w:pStyle w:val="Prrafodelista"/>
+        <w:numPr>
+          <w:ilvl w:val="0"/>
+          <w:numId w:val="7"/>
+        </w:numPr>
+        <w:spacing w:line="276" w:lineRule="auto"/>
+        <w:rPr>
+          <w:rFonts w:ascii="Times New Roman" w:hAnsi="Times New Roman" w:cs="Times New Roman"/>
+        </w:rPr>
+      </w:pPr>
+      <w:r>
+        <w:rPr>
+          <w:rFonts w:ascii="Times New Roman" w:hAnsi="Times New Roman" w:cs="Times New Roman"/>
+        </w:rPr>
+        <w:t>Control de entradas y salidas.</w:t>
+      </w:r>
+    </w:p>
+    <w:p>
+      <w:pPr>
+        <w:pStyle w:val="Prrafodelista"/>
+        <w:numPr>
+          <w:ilvl w:val="0"/>
+          <w:numId w:val="7"/>
+        </w:numPr>
+        <w:spacing w:line="276" w:lineRule="auto"/>
+        <w:rPr>
+          <w:rFonts w:ascii="Times New Roman" w:hAnsi="Times New Roman" w:cs="Times New Roman"/>
+        </w:rPr>
+      </w:pPr>
+      <w:r>
+        <w:rPr>
+          <w:rFonts w:ascii="Times New Roman" w:hAnsi="Times New Roman" w:cs="Times New Roman"/>
+        </w:rPr>
+        <w:t>Generación de reportes automáticos.</w:t>
+      </w:r>
+    </w:p>
+    <w:p>
+      <w:pPr>
+        <w:pStyle w:val="Prrafodelista"/>
+        <w:spacing w:line="276" w:lineRule="auto"/>
+        <w:ind w:left="1080"/>
+        <w:rPr>
+          <w:rFonts w:ascii="Times New Roman" w:hAnsi="Times New Roman" w:cs="Times New Roman"/>
+        </w:rPr>
+      </w:pPr>
+    </w:p>
+    <w:p>
+      <w:pPr>
+        <w:pStyle w:val="Prrafodelista"/>
         <w:numPr>
           <w:ilvl w:val="0"/>
           <w:numId w:val="3"/>
@@ -571,6 +2794,27 @@
     </w:p>
     <w:p>
       <w:pPr>
+        <w:spacing w:line="276" w:lineRule="auto"/>
+        <w:ind w:left="708"/>
+        <w:rPr>
+          <w:rFonts w:ascii="Times New Roman" w:hAnsi="Times New Roman" w:cs="Times New Roman"/>
+        </w:rPr>
+      </w:pPr>
+      <w:r>
+        <w:rPr>
+          <w:rFonts w:ascii="Times New Roman" w:hAnsi="Times New Roman" w:cs="Times New Roman"/>
+        </w:rPr>
+        <w:t>El sistema debe tener disponibilidad como mínimo en el horario laboral. Idealmente debe estar disponible 24/</w:t>
+      </w:r>
+      <w:r>
+        <w:rPr>
+          <w:rFonts w:ascii="Times New Roman" w:hAnsi="Times New Roman" w:cs="Times New Roman"/>
+        </w:rPr>
+        <w:t>7 para que se permitan consultas en cualquier momento.</w:t>
+      </w:r>
+    </w:p>
+    <w:p>
+      <w:pPr>
         <w:pStyle w:val="Prrafodelista"/>
         <w:numPr>
           <w:ilvl w:val="0"/>
@@ -591,6 +2835,117 @@
     <w:p>
       <w:pPr>
         <w:pStyle w:val="Prrafodelista"/>
+        <w:spacing w:line="276" w:lineRule="auto"/>
+        <w:ind w:left="1080"/>
+        <w:rPr>
+          <w:rFonts w:ascii="Times New Roman" w:hAnsi="Times New Roman" w:cs="Times New Roman"/>
+        </w:rPr>
+      </w:pPr>
+      <w:r>
+        <w:rPr>
+          <w:rFonts w:ascii="Times New Roman" w:hAnsi="Times New Roman" w:cs="Times New Roman"/>
+        </w:rPr>
+        <w:t>Se espera:</w:t>
+      </w:r>
+    </w:p>
+    <w:p>
+      <w:pPr>
+        <w:pStyle w:val="Prrafodelista"/>
+        <w:numPr>
+          <w:ilvl w:val="0"/>
+          <w:numId w:val="7"/>
+        </w:numPr>
+        <w:spacing w:line="276" w:lineRule="auto"/>
+        <w:rPr>
+          <w:rFonts w:ascii="Times New Roman" w:hAnsi="Times New Roman" w:cs="Times New Roman"/>
+        </w:rPr>
+      </w:pPr>
+      <w:r>
+        <w:rPr>
+          <w:rFonts w:ascii="Times New Roman" w:hAnsi="Times New Roman" w:cs="Times New Roman"/>
+        </w:rPr>
+        <w:t>Autenticación de usuarios.</w:t>
+      </w:r>
+    </w:p>
+    <w:p>
+      <w:pPr>
+        <w:pStyle w:val="Prrafodelista"/>
+        <w:numPr>
+          <w:ilvl w:val="0"/>
+          <w:numId w:val="7"/>
+        </w:numPr>
+        <w:spacing w:line="276" w:lineRule="auto"/>
+        <w:rPr>
+          <w:rFonts w:ascii="Times New Roman" w:hAnsi="Times New Roman" w:cs="Times New Roman"/>
+        </w:rPr>
+      </w:pPr>
+      <w:r>
+        <w:rPr>
+          <w:rFonts w:ascii="Times New Roman" w:hAnsi="Times New Roman" w:cs="Times New Roman"/>
+        </w:rPr>
+        <w:t>Encriptación básica de contraseñas.</w:t>
+      </w:r>
+    </w:p>
+    <w:p>
+      <w:pPr>
+        <w:pStyle w:val="Prrafodelista"/>
+        <w:numPr>
+          <w:ilvl w:val="0"/>
+          <w:numId w:val="7"/>
+        </w:numPr>
+        <w:spacing w:line="276" w:lineRule="auto"/>
+        <w:rPr>
+          <w:rFonts w:ascii="Times New Roman" w:hAnsi="Times New Roman" w:cs="Times New Roman"/>
+        </w:rPr>
+      </w:pPr>
+      <w:r>
+        <w:rPr>
+          <w:rFonts w:ascii="Times New Roman" w:hAnsi="Times New Roman" w:cs="Times New Roman"/>
+        </w:rPr>
+        <w:t>Roles y permisos diferenciados.</w:t>
+      </w:r>
+    </w:p>
+    <w:p>
+      <w:pPr>
+        <w:pStyle w:val="Prrafodelista"/>
+        <w:numPr>
+          <w:ilvl w:val="0"/>
+          <w:numId w:val="7"/>
+        </w:numPr>
+        <w:spacing w:line="276" w:lineRule="auto"/>
+        <w:rPr>
+          <w:rFonts w:ascii="Times New Roman" w:hAnsi="Times New Roman" w:cs="Times New Roman"/>
+        </w:rPr>
+      </w:pPr>
+      <w:r>
+        <w:rPr>
+          <w:rFonts w:ascii="Times New Roman" w:hAnsi="Times New Roman" w:cs="Times New Roman"/>
+        </w:rPr>
+        <w:t>Protección contra registros inválidos.</w:t>
+      </w:r>
+    </w:p>
+    <w:p>
+      <w:pPr>
+        <w:pStyle w:val="Prrafodelista"/>
+        <w:numPr>
+          <w:ilvl w:val="0"/>
+          <w:numId w:val="7"/>
+        </w:numPr>
+        <w:spacing w:line="276" w:lineRule="auto"/>
+        <w:rPr>
+          <w:rFonts w:ascii="Times New Roman" w:hAnsi="Times New Roman" w:cs="Times New Roman"/>
+        </w:rPr>
+      </w:pPr>
+      <w:r>
+        <w:rPr>
+          <w:rFonts w:ascii="Times New Roman" w:hAnsi="Times New Roman" w:cs="Times New Roman"/>
+        </w:rPr>
+        <w:t>Control de acceso a información sensible.</w:t>
+      </w:r>
+    </w:p>
+    <w:p>
+      <w:pPr>
+        <w:pStyle w:val="Prrafodelista"/>
         <w:numPr>
           <w:ilvl w:val="0"/>
           <w:numId w:val="4"/>
@@ -609,6 +2964,32 @@
     </w:p>
     <w:p>
       <w:pPr>
+        <w:spacing w:line="276" w:lineRule="auto"/>
+        <w:rPr>
+          <w:rFonts w:ascii="Times New Roman" w:hAnsi="Times New Roman" w:cs="Times New Roman"/>
+        </w:rPr>
+      </w:pPr>
+      <w:r>
+        <w:rPr>
+          <w:rFonts w:ascii="Times New Roman" w:hAnsi="Times New Roman" w:cs="Times New Roman"/>
+        </w:rPr>
+        <w:t>El</w:t>
+      </w:r>
+      <w:r>
+        <w:rPr>
+          <w:rFonts w:ascii="Times New Roman" w:hAnsi="Times New Roman" w:cs="Times New Roman"/>
+        </w:rPr>
+        <w:t xml:space="preserve"> sistema debe </w:t>
+      </w:r>
+      <w:r>
+        <w:rPr>
+          <w:rFonts w:ascii="Times New Roman" w:hAnsi="Times New Roman" w:cs="Times New Roman"/>
+        </w:rPr>
+        <w:t>responder en menos de 2s en consultas normales, esto garantiza la eficiencia de la empresa.</w:t>
+      </w:r>
+    </w:p>
+    <w:p>
+      <w:pPr>
         <w:pStyle w:val="Prrafodelista"/>
         <w:numPr>
           <w:ilvl w:val="0"/>
@@ -623,8 +3004,101 @@
         <w:rPr>
           <w:rFonts w:ascii="Times New Roman" w:hAnsi="Times New Roman" w:cs="Times New Roman"/>
         </w:rPr>
+        <w:lastRenderedPageBreak/>
         <w:t>¿El sistema debe ser escalable para más usuarios o sucursales?</w:t>
       </w:r>
+    </w:p>
+    <w:p>
+      <w:pPr>
+        <w:spacing w:line="276" w:lineRule="auto"/>
+        <w:ind w:left="720"/>
+        <w:rPr>
+          <w:rFonts w:ascii="Times New Roman" w:hAnsi="Times New Roman" w:cs="Times New Roman"/>
+        </w:rPr>
+      </w:pPr>
+      <w:r>
+        <w:rPr>
+          <w:rFonts w:ascii="Times New Roman" w:hAnsi="Times New Roman" w:cs="Times New Roman"/>
+        </w:rPr>
+        <w:t>Sí</w:t>
+      </w:r>
+      <w:r>
+        <w:rPr>
+          <w:rFonts w:ascii="Times New Roman" w:hAnsi="Times New Roman" w:cs="Times New Roman"/>
+        </w:rPr>
+        <w:t>, el sistema debe permitir</w:t>
+      </w:r>
+      <w:r>
+        <w:rPr>
+          <w:rFonts w:ascii="Times New Roman" w:hAnsi="Times New Roman" w:cs="Times New Roman"/>
+        </w:rPr>
+        <w:t>:</w:t>
+      </w:r>
+    </w:p>
+    <w:p>
+      <w:pPr>
+        <w:pStyle w:val="Prrafodelista"/>
+        <w:numPr>
+          <w:ilvl w:val="0"/>
+          <w:numId w:val="7"/>
+        </w:numPr>
+        <w:spacing w:line="276" w:lineRule="auto"/>
+        <w:rPr>
+          <w:rFonts w:ascii="Times New Roman" w:hAnsi="Times New Roman" w:cs="Times New Roman"/>
+        </w:rPr>
+      </w:pPr>
+      <w:r>
+        <w:rPr>
+          <w:rFonts w:ascii="Times New Roman" w:hAnsi="Times New Roman" w:cs="Times New Roman"/>
+        </w:rPr>
+        <w:t>Agregar más usuarios.</w:t>
+      </w:r>
+    </w:p>
+    <w:p>
+      <w:pPr>
+        <w:pStyle w:val="Prrafodelista"/>
+        <w:numPr>
+          <w:ilvl w:val="0"/>
+          <w:numId w:val="7"/>
+        </w:numPr>
+        <w:spacing w:line="276" w:lineRule="auto"/>
+        <w:rPr>
+          <w:rFonts w:ascii="Times New Roman" w:hAnsi="Times New Roman" w:cs="Times New Roman"/>
+        </w:rPr>
+      </w:pPr>
+      <w:r>
+        <w:rPr>
+          <w:rFonts w:ascii="Times New Roman" w:hAnsi="Times New Roman" w:cs="Times New Roman"/>
+        </w:rPr>
+        <w:t>Incluir nuevas sucursales.</w:t>
+      </w:r>
+    </w:p>
+    <w:p>
+      <w:pPr>
+        <w:pStyle w:val="Prrafodelista"/>
+        <w:numPr>
+          <w:ilvl w:val="0"/>
+          <w:numId w:val="7"/>
+        </w:numPr>
+        <w:spacing w:line="276" w:lineRule="auto"/>
+        <w:rPr>
+          <w:rFonts w:ascii="Times New Roman" w:hAnsi="Times New Roman" w:cs="Times New Roman"/>
+        </w:rPr>
+      </w:pPr>
+      <w:r>
+        <w:rPr>
+          <w:rFonts w:ascii="Times New Roman" w:hAnsi="Times New Roman" w:cs="Times New Roman"/>
+        </w:rPr>
+        <w:t>Adaptarse a futuras mejoras tecnológicas.</w:t>
+      </w:r>
+    </w:p>
+    <w:p>
+      <w:pPr>
+        <w:spacing w:line="276" w:lineRule="auto"/>
+        <w:rPr>
+          <w:rFonts w:ascii="Times New Roman" w:hAnsi="Times New Roman" w:cs="Times New Roman"/>
+        </w:rPr>
+      </w:pPr>
     </w:p>
     <w:p>
       <w:pPr>
@@ -644,6 +3118,245 @@
         </w:rPr>
         <w:t>¿Qué navegadores y dispositivos deben ser compatibles?</w:t>
       </w:r>
+    </w:p>
+    <w:p>
+      <w:pPr>
+        <w:pStyle w:val="Prrafodelista"/>
+        <w:spacing w:line="276" w:lineRule="auto"/>
+        <w:ind w:left="1080"/>
+        <w:rPr>
+          <w:rFonts w:ascii="Times New Roman" w:hAnsi="Times New Roman" w:cs="Times New Roman"/>
+        </w:rPr>
+      </w:pPr>
+      <w:r>
+        <w:rPr>
+          <w:rFonts w:ascii="Times New Roman" w:hAnsi="Times New Roman" w:cs="Times New Roman"/>
+        </w:rPr>
+        <w:t>Debe ser compatible con</w:t>
+      </w:r>
+      <w:r>
+        <w:rPr>
+          <w:rFonts w:ascii="Times New Roman" w:hAnsi="Times New Roman" w:cs="Times New Roman"/>
+        </w:rPr>
+        <w:t xml:space="preserve"> todos los navegadores más usados</w:t>
+      </w:r>
+      <w:r>
+        <w:rPr>
+          <w:rFonts w:ascii="Times New Roman" w:hAnsi="Times New Roman" w:cs="Times New Roman"/>
+        </w:rPr>
+        <w:t>:</w:t>
+      </w:r>
+    </w:p>
+    <w:p>
+      <w:pPr>
+        <w:pStyle w:val="Prrafodelista"/>
+        <w:numPr>
+          <w:ilvl w:val="0"/>
+          <w:numId w:val="7"/>
+        </w:numPr>
+        <w:spacing w:line="276" w:lineRule="auto"/>
+        <w:rPr>
+          <w:rFonts w:ascii="Times New Roman" w:hAnsi="Times New Roman" w:cs="Times New Roman"/>
+        </w:rPr>
+      </w:pPr>
+      <w:r>
+        <w:rPr>
+          <w:rFonts w:ascii="Times New Roman" w:hAnsi="Times New Roman" w:cs="Times New Roman"/>
+        </w:rPr>
+        <w:t>Google Chrome</w:t>
+      </w:r>
+    </w:p>
+    <w:p>
+      <w:pPr>
+        <w:pStyle w:val="Prrafodelista"/>
+        <w:numPr>
+          <w:ilvl w:val="0"/>
+          <w:numId w:val="7"/>
+        </w:numPr>
+        <w:spacing w:line="276" w:lineRule="auto"/>
+        <w:rPr>
+          <w:rFonts w:ascii="Times New Roman" w:hAnsi="Times New Roman" w:cs="Times New Roman"/>
+        </w:rPr>
+      </w:pPr>
+      <w:r>
+        <w:rPr>
+          <w:rFonts w:ascii="Times New Roman" w:hAnsi="Times New Roman" w:cs="Times New Roman"/>
+        </w:rPr>
+        <w:t>Microsoft Edge</w:t>
+      </w:r>
+    </w:p>
+    <w:p>
+      <w:pPr>
+        <w:pStyle w:val="Prrafodelista"/>
+        <w:numPr>
+          <w:ilvl w:val="0"/>
+          <w:numId w:val="7"/>
+        </w:numPr>
+        <w:spacing w:line="276" w:lineRule="auto"/>
+        <w:rPr>
+          <w:rFonts w:ascii="Times New Roman" w:hAnsi="Times New Roman" w:cs="Times New Roman"/>
+        </w:rPr>
+      </w:pPr>
+      <w:r>
+        <w:rPr>
+          <w:rFonts w:ascii="Times New Roman" w:hAnsi="Times New Roman" w:cs="Times New Roman"/>
+        </w:rPr>
+        <w:t>Mozilla Firefox</w:t>
+      </w:r>
+    </w:p>
+    <w:p>
+      <w:pPr>
+        <w:pStyle w:val="Prrafodelista"/>
+        <w:numPr>
+          <w:ilvl w:val="0"/>
+          <w:numId w:val="7"/>
+        </w:numPr>
+        <w:spacing w:line="276" w:lineRule="auto"/>
+        <w:rPr>
+          <w:rFonts w:ascii="Times New Roman" w:hAnsi="Times New Roman" w:cs="Times New Roman"/>
+        </w:rPr>
+      </w:pPr>
+      <w:r>
+        <w:rPr>
+          <w:rFonts w:ascii="Times New Roman" w:hAnsi="Times New Roman" w:cs="Times New Roman"/>
+        </w:rPr>
+        <w:t>Brave</w:t>
+      </w:r>
+    </w:p>
+    <w:p>
+      <w:pPr>
+        <w:pStyle w:val="Prrafodelista"/>
+        <w:numPr>
+          <w:ilvl w:val="0"/>
+          <w:numId w:val="7"/>
+        </w:numPr>
+        <w:spacing w:line="276" w:lineRule="auto"/>
+        <w:rPr>
+          <w:rFonts w:ascii="Times New Roman" w:hAnsi="Times New Roman" w:cs="Times New Roman"/>
+        </w:rPr>
+      </w:pPr>
+      <w:r>
+        <w:rPr>
+          <w:rFonts w:ascii="Times New Roman" w:hAnsi="Times New Roman" w:cs="Times New Roman"/>
+        </w:rPr>
+        <w:t>Opera</w:t>
+      </w:r>
+    </w:p>
+    <w:p>
+      <w:pPr>
+        <w:pStyle w:val="Prrafodelista"/>
+        <w:spacing w:line="276" w:lineRule="auto"/>
+        <w:ind w:left="1080"/>
+        <w:rPr>
+          <w:rFonts w:ascii="Times New Roman" w:hAnsi="Times New Roman" w:cs="Times New Roman"/>
+        </w:rPr>
+      </w:pPr>
+      <w:r>
+        <w:rPr>
+          <w:rFonts w:ascii="Times New Roman" w:hAnsi="Times New Roman" w:cs="Times New Roman"/>
+        </w:rPr>
+        <w:t xml:space="preserve">Y funcionar correctamente </w:t>
+      </w:r>
+      <w:r>
+        <w:rPr>
+          <w:rFonts w:ascii="Times New Roman" w:hAnsi="Times New Roman" w:cs="Times New Roman"/>
+        </w:rPr>
+        <w:t>y de manera responsiva en</w:t>
+      </w:r>
+      <w:r>
+        <w:rPr>
+          <w:rFonts w:ascii="Times New Roman" w:hAnsi="Times New Roman" w:cs="Times New Roman"/>
+        </w:rPr>
+        <w:t>:</w:t>
+      </w:r>
+    </w:p>
+    <w:p>
+      <w:pPr>
+        <w:pStyle w:val="Prrafodelista"/>
+        <w:numPr>
+          <w:ilvl w:val="0"/>
+          <w:numId w:val="7"/>
+        </w:numPr>
+        <w:spacing w:line="276" w:lineRule="auto"/>
+        <w:rPr>
+          <w:rFonts w:ascii="Times New Roman" w:hAnsi="Times New Roman" w:cs="Times New Roman"/>
+        </w:rPr>
+      </w:pPr>
+      <w:r>
+        <w:rPr>
+          <w:rFonts w:ascii="Times New Roman" w:hAnsi="Times New Roman" w:cs="Times New Roman"/>
+        </w:rPr>
+        <w:t>Computadores de escritorio</w:t>
+      </w:r>
+    </w:p>
+    <w:p>
+      <w:pPr>
+        <w:pStyle w:val="Prrafodelista"/>
+        <w:numPr>
+          <w:ilvl w:val="0"/>
+          <w:numId w:val="7"/>
+        </w:numPr>
+        <w:spacing w:line="276" w:lineRule="auto"/>
+        <w:rPr>
+          <w:rFonts w:ascii="Times New Roman" w:hAnsi="Times New Roman" w:cs="Times New Roman"/>
+        </w:rPr>
+      </w:pPr>
+      <w:r>
+        <w:rPr>
+          <w:rFonts w:ascii="Times New Roman" w:hAnsi="Times New Roman" w:cs="Times New Roman"/>
+        </w:rPr>
+        <w:t>Portátiles</w:t>
+      </w:r>
+    </w:p>
+    <w:p>
+      <w:pPr>
+        <w:pStyle w:val="Prrafodelista"/>
+        <w:numPr>
+          <w:ilvl w:val="0"/>
+          <w:numId w:val="7"/>
+        </w:numPr>
+        <w:spacing w:line="276" w:lineRule="auto"/>
+        <w:rPr>
+          <w:rFonts w:ascii="Times New Roman" w:hAnsi="Times New Roman" w:cs="Times New Roman"/>
+        </w:rPr>
+      </w:pPr>
+      <w:proofErr w:type="spellStart"/>
+      <w:r>
+        <w:rPr>
+          <w:rFonts w:ascii="Times New Roman" w:hAnsi="Times New Roman" w:cs="Times New Roman"/>
+        </w:rPr>
+        <w:t>Tablets</w:t>
+      </w:r>
+      <w:proofErr w:type="spellEnd"/>
+    </w:p>
+    <w:p>
+      <w:pPr>
+        <w:pStyle w:val="Prrafodelista"/>
+        <w:numPr>
+          <w:ilvl w:val="0"/>
+          <w:numId w:val="7"/>
+        </w:numPr>
+        <w:spacing w:line="276" w:lineRule="auto"/>
+        <w:rPr>
+          <w:rFonts w:ascii="Times New Roman" w:hAnsi="Times New Roman" w:cs="Times New Roman"/>
+        </w:rPr>
+      </w:pPr>
+      <w:r>
+        <w:rPr>
+          <w:rFonts w:ascii="Times New Roman" w:hAnsi="Times New Roman" w:cs="Times New Roman"/>
+        </w:rPr>
+        <w:t>Celulares (Ya sea mediante una aplicación web, o mediante el navegador del dispositivo)</w:t>
+      </w:r>
+    </w:p>
+    <w:p>
+      <w:pPr>
+        <w:pStyle w:val="Prrafodelista"/>
+        <w:spacing w:line="276" w:lineRule="auto"/>
+        <w:ind w:left="1080"/>
+        <w:rPr>
+          <w:rFonts w:ascii="Times New Roman" w:hAnsi="Times New Roman" w:cs="Times New Roman"/>
+        </w:rPr>
+      </w:pPr>
     </w:p>
     <w:sectPr>
       <w:pgSz w:w="12240" w:h="15840"/>
@@ -1082,6 +3795,1662 @@
       </w:rPr>
     </w:lvl>
   </w:abstractNum>
+  <w:abstractNum w:abstractNumId="4" w15:restartNumberingAfterBreak="0">
+    <w:nsid w:val="34E166B2"/>
+    <w:multiLevelType w:val="multilevel"/>
+    <w:tmpl w:val="353E0472"/>
+    <w:lvl w:ilvl="0">
+      <w:start w:val="1"/>
+      <w:numFmt w:val="bullet"/>
+      <w:lvlText w:val=""/>
+      <w:lvlJc w:val="left"/>
+      <w:pPr>
+        <w:tabs>
+          <w:tab w:val="num" w:pos="720"/>
+        </w:tabs>
+        <w:ind w:left="720" w:hanging="360"/>
+      </w:pPr>
+      <w:rPr>
+        <w:rFonts w:ascii="Symbol" w:hAnsi="Symbol" w:hint="default"/>
+        <w:sz w:val="20"/>
+      </w:rPr>
+    </w:lvl>
+    <w:lvl w:ilvl="1" w:tentative="1">
+      <w:start w:val="1"/>
+      <w:numFmt w:val="bullet"/>
+      <w:lvlText w:val="o"/>
+      <w:lvlJc w:val="left"/>
+      <w:pPr>
+        <w:tabs>
+          <w:tab w:val="num" w:pos="1440"/>
+        </w:tabs>
+        <w:ind w:left="1440" w:hanging="360"/>
+      </w:pPr>
+      <w:rPr>
+        <w:rFonts w:ascii="Courier New" w:hAnsi="Courier New" w:hint="default"/>
+        <w:sz w:val="20"/>
+      </w:rPr>
+    </w:lvl>
+    <w:lvl w:ilvl="2" w:tentative="1">
+      <w:start w:val="1"/>
+      <w:numFmt w:val="bullet"/>
+      <w:lvlText w:val=""/>
+      <w:lvlJc w:val="left"/>
+      <w:pPr>
+        <w:tabs>
+          <w:tab w:val="num" w:pos="2160"/>
+        </w:tabs>
+        <w:ind w:left="2160" w:hanging="360"/>
+      </w:pPr>
+      <w:rPr>
+        <w:rFonts w:ascii="Wingdings" w:hAnsi="Wingdings" w:hint="default"/>
+        <w:sz w:val="20"/>
+      </w:rPr>
+    </w:lvl>
+    <w:lvl w:ilvl="3" w:tentative="1">
+      <w:start w:val="1"/>
+      <w:numFmt w:val="bullet"/>
+      <w:lvlText w:val=""/>
+      <w:lvlJc w:val="left"/>
+      <w:pPr>
+        <w:tabs>
+          <w:tab w:val="num" w:pos="2880"/>
+        </w:tabs>
+        <w:ind w:left="2880" w:hanging="360"/>
+      </w:pPr>
+      <w:rPr>
+        <w:rFonts w:ascii="Wingdings" w:hAnsi="Wingdings" w:hint="default"/>
+        <w:sz w:val="20"/>
+      </w:rPr>
+    </w:lvl>
+    <w:lvl w:ilvl="4" w:tentative="1">
+      <w:start w:val="1"/>
+      <w:numFmt w:val="bullet"/>
+      <w:lvlText w:val=""/>
+      <w:lvlJc w:val="left"/>
+      <w:pPr>
+        <w:tabs>
+          <w:tab w:val="num" w:pos="3600"/>
+        </w:tabs>
+        <w:ind w:left="3600" w:hanging="360"/>
+      </w:pPr>
+      <w:rPr>
+        <w:rFonts w:ascii="Wingdings" w:hAnsi="Wingdings" w:hint="default"/>
+        <w:sz w:val="20"/>
+      </w:rPr>
+    </w:lvl>
+    <w:lvl w:ilvl="5" w:tentative="1">
+      <w:start w:val="1"/>
+      <w:numFmt w:val="bullet"/>
+      <w:lvlText w:val=""/>
+      <w:lvlJc w:val="left"/>
+      <w:pPr>
+        <w:tabs>
+          <w:tab w:val="num" w:pos="4320"/>
+        </w:tabs>
+        <w:ind w:left="4320" w:hanging="360"/>
+      </w:pPr>
+      <w:rPr>
+        <w:rFonts w:ascii="Wingdings" w:hAnsi="Wingdings" w:hint="default"/>
+        <w:sz w:val="20"/>
+      </w:rPr>
+    </w:lvl>
+    <w:lvl w:ilvl="6" w:tentative="1">
+      <w:start w:val="1"/>
+      <w:numFmt w:val="bullet"/>
+      <w:lvlText w:val=""/>
+      <w:lvlJc w:val="left"/>
+      <w:pPr>
+        <w:tabs>
+          <w:tab w:val="num" w:pos="5040"/>
+        </w:tabs>
+        <w:ind w:left="5040" w:hanging="360"/>
+      </w:pPr>
+      <w:rPr>
+        <w:rFonts w:ascii="Wingdings" w:hAnsi="Wingdings" w:hint="default"/>
+        <w:sz w:val="20"/>
+      </w:rPr>
+    </w:lvl>
+    <w:lvl w:ilvl="7" w:tentative="1">
+      <w:start w:val="1"/>
+      <w:numFmt w:val="bullet"/>
+      <w:lvlText w:val=""/>
+      <w:lvlJc w:val="left"/>
+      <w:pPr>
+        <w:tabs>
+          <w:tab w:val="num" w:pos="5760"/>
+        </w:tabs>
+        <w:ind w:left="5760" w:hanging="360"/>
+      </w:pPr>
+      <w:rPr>
+        <w:rFonts w:ascii="Wingdings" w:hAnsi="Wingdings" w:hint="default"/>
+        <w:sz w:val="20"/>
+      </w:rPr>
+    </w:lvl>
+    <w:lvl w:ilvl="8" w:tentative="1">
+      <w:start w:val="1"/>
+      <w:numFmt w:val="bullet"/>
+      <w:lvlText w:val=""/>
+      <w:lvlJc w:val="left"/>
+      <w:pPr>
+        <w:tabs>
+          <w:tab w:val="num" w:pos="6480"/>
+        </w:tabs>
+        <w:ind w:left="6480" w:hanging="360"/>
+      </w:pPr>
+      <w:rPr>
+        <w:rFonts w:ascii="Wingdings" w:hAnsi="Wingdings" w:hint="default"/>
+        <w:sz w:val="20"/>
+      </w:rPr>
+    </w:lvl>
+  </w:abstractNum>
+  <w:abstractNum w:abstractNumId="5" w15:restartNumberingAfterBreak="0">
+    <w:nsid w:val="365B71A9"/>
+    <w:multiLevelType w:val="multilevel"/>
+    <w:tmpl w:val="7BA4AD42"/>
+    <w:lvl w:ilvl="0">
+      <w:start w:val="1"/>
+      <w:numFmt w:val="bullet"/>
+      <w:lvlText w:val=""/>
+      <w:lvlJc w:val="left"/>
+      <w:pPr>
+        <w:tabs>
+          <w:tab w:val="num" w:pos="720"/>
+        </w:tabs>
+        <w:ind w:left="720" w:hanging="360"/>
+      </w:pPr>
+      <w:rPr>
+        <w:rFonts w:ascii="Symbol" w:hAnsi="Symbol" w:hint="default"/>
+        <w:sz w:val="20"/>
+      </w:rPr>
+    </w:lvl>
+    <w:lvl w:ilvl="1" w:tentative="1">
+      <w:start w:val="1"/>
+      <w:numFmt w:val="bullet"/>
+      <w:lvlText w:val="o"/>
+      <w:lvlJc w:val="left"/>
+      <w:pPr>
+        <w:tabs>
+          <w:tab w:val="num" w:pos="1440"/>
+        </w:tabs>
+        <w:ind w:left="1440" w:hanging="360"/>
+      </w:pPr>
+      <w:rPr>
+        <w:rFonts w:ascii="Courier New" w:hAnsi="Courier New" w:hint="default"/>
+        <w:sz w:val="20"/>
+      </w:rPr>
+    </w:lvl>
+    <w:lvl w:ilvl="2" w:tentative="1">
+      <w:start w:val="1"/>
+      <w:numFmt w:val="bullet"/>
+      <w:lvlText w:val=""/>
+      <w:lvlJc w:val="left"/>
+      <w:pPr>
+        <w:tabs>
+          <w:tab w:val="num" w:pos="2160"/>
+        </w:tabs>
+        <w:ind w:left="2160" w:hanging="360"/>
+      </w:pPr>
+      <w:rPr>
+        <w:rFonts w:ascii="Wingdings" w:hAnsi="Wingdings" w:hint="default"/>
+        <w:sz w:val="20"/>
+      </w:rPr>
+    </w:lvl>
+    <w:lvl w:ilvl="3" w:tentative="1">
+      <w:start w:val="1"/>
+      <w:numFmt w:val="bullet"/>
+      <w:lvlText w:val=""/>
+      <w:lvlJc w:val="left"/>
+      <w:pPr>
+        <w:tabs>
+          <w:tab w:val="num" w:pos="2880"/>
+        </w:tabs>
+        <w:ind w:left="2880" w:hanging="360"/>
+      </w:pPr>
+      <w:rPr>
+        <w:rFonts w:ascii="Wingdings" w:hAnsi="Wingdings" w:hint="default"/>
+        <w:sz w:val="20"/>
+      </w:rPr>
+    </w:lvl>
+    <w:lvl w:ilvl="4" w:tentative="1">
+      <w:start w:val="1"/>
+      <w:numFmt w:val="bullet"/>
+      <w:lvlText w:val=""/>
+      <w:lvlJc w:val="left"/>
+      <w:pPr>
+        <w:tabs>
+          <w:tab w:val="num" w:pos="3600"/>
+        </w:tabs>
+        <w:ind w:left="3600" w:hanging="360"/>
+      </w:pPr>
+      <w:rPr>
+        <w:rFonts w:ascii="Wingdings" w:hAnsi="Wingdings" w:hint="default"/>
+        <w:sz w:val="20"/>
+      </w:rPr>
+    </w:lvl>
+    <w:lvl w:ilvl="5" w:tentative="1">
+      <w:start w:val="1"/>
+      <w:numFmt w:val="bullet"/>
+      <w:lvlText w:val=""/>
+      <w:lvlJc w:val="left"/>
+      <w:pPr>
+        <w:tabs>
+          <w:tab w:val="num" w:pos="4320"/>
+        </w:tabs>
+        <w:ind w:left="4320" w:hanging="360"/>
+      </w:pPr>
+      <w:rPr>
+        <w:rFonts w:ascii="Wingdings" w:hAnsi="Wingdings" w:hint="default"/>
+        <w:sz w:val="20"/>
+      </w:rPr>
+    </w:lvl>
+    <w:lvl w:ilvl="6" w:tentative="1">
+      <w:start w:val="1"/>
+      <w:numFmt w:val="bullet"/>
+      <w:lvlText w:val=""/>
+      <w:lvlJc w:val="left"/>
+      <w:pPr>
+        <w:tabs>
+          <w:tab w:val="num" w:pos="5040"/>
+        </w:tabs>
+        <w:ind w:left="5040" w:hanging="360"/>
+      </w:pPr>
+      <w:rPr>
+        <w:rFonts w:ascii="Wingdings" w:hAnsi="Wingdings" w:hint="default"/>
+        <w:sz w:val="20"/>
+      </w:rPr>
+    </w:lvl>
+    <w:lvl w:ilvl="7" w:tentative="1">
+      <w:start w:val="1"/>
+      <w:numFmt w:val="bullet"/>
+      <w:lvlText w:val=""/>
+      <w:lvlJc w:val="left"/>
+      <w:pPr>
+        <w:tabs>
+          <w:tab w:val="num" w:pos="5760"/>
+        </w:tabs>
+        <w:ind w:left="5760" w:hanging="360"/>
+      </w:pPr>
+      <w:rPr>
+        <w:rFonts w:ascii="Wingdings" w:hAnsi="Wingdings" w:hint="default"/>
+        <w:sz w:val="20"/>
+      </w:rPr>
+    </w:lvl>
+    <w:lvl w:ilvl="8" w:tentative="1">
+      <w:start w:val="1"/>
+      <w:numFmt w:val="bullet"/>
+      <w:lvlText w:val=""/>
+      <w:lvlJc w:val="left"/>
+      <w:pPr>
+        <w:tabs>
+          <w:tab w:val="num" w:pos="6480"/>
+        </w:tabs>
+        <w:ind w:left="6480" w:hanging="360"/>
+      </w:pPr>
+      <w:rPr>
+        <w:rFonts w:ascii="Wingdings" w:hAnsi="Wingdings" w:hint="default"/>
+        <w:sz w:val="20"/>
+      </w:rPr>
+    </w:lvl>
+  </w:abstractNum>
+  <w:abstractNum w:abstractNumId="6" w15:restartNumberingAfterBreak="0">
+    <w:nsid w:val="37742DAF"/>
+    <w:multiLevelType w:val="multilevel"/>
+    <w:tmpl w:val="B7141196"/>
+    <w:lvl w:ilvl="0">
+      <w:start w:val="1"/>
+      <w:numFmt w:val="bullet"/>
+      <w:lvlText w:val=""/>
+      <w:lvlJc w:val="left"/>
+      <w:pPr>
+        <w:tabs>
+          <w:tab w:val="num" w:pos="720"/>
+        </w:tabs>
+        <w:ind w:left="720" w:hanging="360"/>
+      </w:pPr>
+      <w:rPr>
+        <w:rFonts w:ascii="Symbol" w:hAnsi="Symbol" w:hint="default"/>
+        <w:sz w:val="20"/>
+      </w:rPr>
+    </w:lvl>
+    <w:lvl w:ilvl="1" w:tentative="1">
+      <w:start w:val="1"/>
+      <w:numFmt w:val="bullet"/>
+      <w:lvlText w:val="o"/>
+      <w:lvlJc w:val="left"/>
+      <w:pPr>
+        <w:tabs>
+          <w:tab w:val="num" w:pos="1440"/>
+        </w:tabs>
+        <w:ind w:left="1440" w:hanging="360"/>
+      </w:pPr>
+      <w:rPr>
+        <w:rFonts w:ascii="Courier New" w:hAnsi="Courier New" w:hint="default"/>
+        <w:sz w:val="20"/>
+      </w:rPr>
+    </w:lvl>
+    <w:lvl w:ilvl="2" w:tentative="1">
+      <w:start w:val="1"/>
+      <w:numFmt w:val="bullet"/>
+      <w:lvlText w:val=""/>
+      <w:lvlJc w:val="left"/>
+      <w:pPr>
+        <w:tabs>
+          <w:tab w:val="num" w:pos="2160"/>
+        </w:tabs>
+        <w:ind w:left="2160" w:hanging="360"/>
+      </w:pPr>
+      <w:rPr>
+        <w:rFonts w:ascii="Wingdings" w:hAnsi="Wingdings" w:hint="default"/>
+        <w:sz w:val="20"/>
+      </w:rPr>
+    </w:lvl>
+    <w:lvl w:ilvl="3" w:tentative="1">
+      <w:start w:val="1"/>
+      <w:numFmt w:val="bullet"/>
+      <w:lvlText w:val=""/>
+      <w:lvlJc w:val="left"/>
+      <w:pPr>
+        <w:tabs>
+          <w:tab w:val="num" w:pos="2880"/>
+        </w:tabs>
+        <w:ind w:left="2880" w:hanging="360"/>
+      </w:pPr>
+      <w:rPr>
+        <w:rFonts w:ascii="Wingdings" w:hAnsi="Wingdings" w:hint="default"/>
+        <w:sz w:val="20"/>
+      </w:rPr>
+    </w:lvl>
+    <w:lvl w:ilvl="4" w:tentative="1">
+      <w:start w:val="1"/>
+      <w:numFmt w:val="bullet"/>
+      <w:lvlText w:val=""/>
+      <w:lvlJc w:val="left"/>
+      <w:pPr>
+        <w:tabs>
+          <w:tab w:val="num" w:pos="3600"/>
+        </w:tabs>
+        <w:ind w:left="3600" w:hanging="360"/>
+      </w:pPr>
+      <w:rPr>
+        <w:rFonts w:ascii="Wingdings" w:hAnsi="Wingdings" w:hint="default"/>
+        <w:sz w:val="20"/>
+      </w:rPr>
+    </w:lvl>
+    <w:lvl w:ilvl="5" w:tentative="1">
+      <w:start w:val="1"/>
+      <w:numFmt w:val="bullet"/>
+      <w:lvlText w:val=""/>
+      <w:lvlJc w:val="left"/>
+      <w:pPr>
+        <w:tabs>
+          <w:tab w:val="num" w:pos="4320"/>
+        </w:tabs>
+        <w:ind w:left="4320" w:hanging="360"/>
+      </w:pPr>
+      <w:rPr>
+        <w:rFonts w:ascii="Wingdings" w:hAnsi="Wingdings" w:hint="default"/>
+        <w:sz w:val="20"/>
+      </w:rPr>
+    </w:lvl>
+    <w:lvl w:ilvl="6" w:tentative="1">
+      <w:start w:val="1"/>
+      <w:numFmt w:val="bullet"/>
+      <w:lvlText w:val=""/>
+      <w:lvlJc w:val="left"/>
+      <w:pPr>
+        <w:tabs>
+          <w:tab w:val="num" w:pos="5040"/>
+        </w:tabs>
+        <w:ind w:left="5040" w:hanging="360"/>
+      </w:pPr>
+      <w:rPr>
+        <w:rFonts w:ascii="Wingdings" w:hAnsi="Wingdings" w:hint="default"/>
+        <w:sz w:val="20"/>
+      </w:rPr>
+    </w:lvl>
+    <w:lvl w:ilvl="7" w:tentative="1">
+      <w:start w:val="1"/>
+      <w:numFmt w:val="bullet"/>
+      <w:lvlText w:val=""/>
+      <w:lvlJc w:val="left"/>
+      <w:pPr>
+        <w:tabs>
+          <w:tab w:val="num" w:pos="5760"/>
+        </w:tabs>
+        <w:ind w:left="5760" w:hanging="360"/>
+      </w:pPr>
+      <w:rPr>
+        <w:rFonts w:ascii="Wingdings" w:hAnsi="Wingdings" w:hint="default"/>
+        <w:sz w:val="20"/>
+      </w:rPr>
+    </w:lvl>
+    <w:lvl w:ilvl="8" w:tentative="1">
+      <w:start w:val="1"/>
+      <w:numFmt w:val="bullet"/>
+      <w:lvlText w:val=""/>
+      <w:lvlJc w:val="left"/>
+      <w:pPr>
+        <w:tabs>
+          <w:tab w:val="num" w:pos="6480"/>
+        </w:tabs>
+        <w:ind w:left="6480" w:hanging="360"/>
+      </w:pPr>
+      <w:rPr>
+        <w:rFonts w:ascii="Wingdings" w:hAnsi="Wingdings" w:hint="default"/>
+        <w:sz w:val="20"/>
+      </w:rPr>
+    </w:lvl>
+  </w:abstractNum>
+  <w:abstractNum w:abstractNumId="7" w15:restartNumberingAfterBreak="0">
+    <w:nsid w:val="414E117A"/>
+    <w:multiLevelType w:val="multilevel"/>
+    <w:tmpl w:val="2CECC700"/>
+    <w:lvl w:ilvl="0">
+      <w:start w:val="1"/>
+      <w:numFmt w:val="decimal"/>
+      <w:lvlText w:val="%1."/>
+      <w:lvlJc w:val="left"/>
+      <w:pPr>
+        <w:tabs>
+          <w:tab w:val="num" w:pos="720"/>
+        </w:tabs>
+        <w:ind w:left="720" w:hanging="360"/>
+      </w:pPr>
+    </w:lvl>
+    <w:lvl w:ilvl="1" w:tentative="1">
+      <w:start w:val="1"/>
+      <w:numFmt w:val="decimal"/>
+      <w:lvlText w:val="%2."/>
+      <w:lvlJc w:val="left"/>
+      <w:pPr>
+        <w:tabs>
+          <w:tab w:val="num" w:pos="1440"/>
+        </w:tabs>
+        <w:ind w:left="1440" w:hanging="360"/>
+      </w:pPr>
+    </w:lvl>
+    <w:lvl w:ilvl="2" w:tentative="1">
+      <w:start w:val="1"/>
+      <w:numFmt w:val="decimal"/>
+      <w:lvlText w:val="%3."/>
+      <w:lvlJc w:val="left"/>
+      <w:pPr>
+        <w:tabs>
+          <w:tab w:val="num" w:pos="2160"/>
+        </w:tabs>
+        <w:ind w:left="2160" w:hanging="360"/>
+      </w:pPr>
+    </w:lvl>
+    <w:lvl w:ilvl="3" w:tentative="1">
+      <w:start w:val="1"/>
+      <w:numFmt w:val="decimal"/>
+      <w:lvlText w:val="%4."/>
+      <w:lvlJc w:val="left"/>
+      <w:pPr>
+        <w:tabs>
+          <w:tab w:val="num" w:pos="2880"/>
+        </w:tabs>
+        <w:ind w:left="2880" w:hanging="360"/>
+      </w:pPr>
+    </w:lvl>
+    <w:lvl w:ilvl="4" w:tentative="1">
+      <w:start w:val="1"/>
+      <w:numFmt w:val="decimal"/>
+      <w:lvlText w:val="%5."/>
+      <w:lvlJc w:val="left"/>
+      <w:pPr>
+        <w:tabs>
+          <w:tab w:val="num" w:pos="3600"/>
+        </w:tabs>
+        <w:ind w:left="3600" w:hanging="360"/>
+      </w:pPr>
+    </w:lvl>
+    <w:lvl w:ilvl="5" w:tentative="1">
+      <w:start w:val="1"/>
+      <w:numFmt w:val="decimal"/>
+      <w:lvlText w:val="%6."/>
+      <w:lvlJc w:val="left"/>
+      <w:pPr>
+        <w:tabs>
+          <w:tab w:val="num" w:pos="4320"/>
+        </w:tabs>
+        <w:ind w:left="4320" w:hanging="360"/>
+      </w:pPr>
+    </w:lvl>
+    <w:lvl w:ilvl="6" w:tentative="1">
+      <w:start w:val="1"/>
+      <w:numFmt w:val="decimal"/>
+      <w:lvlText w:val="%7."/>
+      <w:lvlJc w:val="left"/>
+      <w:pPr>
+        <w:tabs>
+          <w:tab w:val="num" w:pos="5040"/>
+        </w:tabs>
+        <w:ind w:left="5040" w:hanging="360"/>
+      </w:pPr>
+    </w:lvl>
+    <w:lvl w:ilvl="7" w:tentative="1">
+      <w:start w:val="1"/>
+      <w:numFmt w:val="decimal"/>
+      <w:lvlText w:val="%8."/>
+      <w:lvlJc w:val="left"/>
+      <w:pPr>
+        <w:tabs>
+          <w:tab w:val="num" w:pos="5760"/>
+        </w:tabs>
+        <w:ind w:left="5760" w:hanging="360"/>
+      </w:pPr>
+    </w:lvl>
+    <w:lvl w:ilvl="8" w:tentative="1">
+      <w:start w:val="1"/>
+      <w:numFmt w:val="decimal"/>
+      <w:lvlText w:val="%9."/>
+      <w:lvlJc w:val="left"/>
+      <w:pPr>
+        <w:tabs>
+          <w:tab w:val="num" w:pos="6480"/>
+        </w:tabs>
+        <w:ind w:left="6480" w:hanging="360"/>
+      </w:pPr>
+    </w:lvl>
+  </w:abstractNum>
+  <w:abstractNum w:abstractNumId="8" w15:restartNumberingAfterBreak="0">
+    <w:nsid w:val="43182A83"/>
+    <w:multiLevelType w:val="multilevel"/>
+    <w:tmpl w:val="1A743B9E"/>
+    <w:lvl w:ilvl="0">
+      <w:start w:val="1"/>
+      <w:numFmt w:val="bullet"/>
+      <w:lvlText w:val=""/>
+      <w:lvlJc w:val="left"/>
+      <w:pPr>
+        <w:tabs>
+          <w:tab w:val="num" w:pos="720"/>
+        </w:tabs>
+        <w:ind w:left="720" w:hanging="360"/>
+      </w:pPr>
+      <w:rPr>
+        <w:rFonts w:ascii="Symbol" w:hAnsi="Symbol" w:hint="default"/>
+        <w:sz w:val="20"/>
+      </w:rPr>
+    </w:lvl>
+    <w:lvl w:ilvl="1" w:tentative="1">
+      <w:start w:val="1"/>
+      <w:numFmt w:val="bullet"/>
+      <w:lvlText w:val="o"/>
+      <w:lvlJc w:val="left"/>
+      <w:pPr>
+        <w:tabs>
+          <w:tab w:val="num" w:pos="1440"/>
+        </w:tabs>
+        <w:ind w:left="1440" w:hanging="360"/>
+      </w:pPr>
+      <w:rPr>
+        <w:rFonts w:ascii="Courier New" w:hAnsi="Courier New" w:hint="default"/>
+        <w:sz w:val="20"/>
+      </w:rPr>
+    </w:lvl>
+    <w:lvl w:ilvl="2" w:tentative="1">
+      <w:start w:val="1"/>
+      <w:numFmt w:val="bullet"/>
+      <w:lvlText w:val=""/>
+      <w:lvlJc w:val="left"/>
+      <w:pPr>
+        <w:tabs>
+          <w:tab w:val="num" w:pos="2160"/>
+        </w:tabs>
+        <w:ind w:left="2160" w:hanging="360"/>
+      </w:pPr>
+      <w:rPr>
+        <w:rFonts w:ascii="Wingdings" w:hAnsi="Wingdings" w:hint="default"/>
+        <w:sz w:val="20"/>
+      </w:rPr>
+    </w:lvl>
+    <w:lvl w:ilvl="3" w:tentative="1">
+      <w:start w:val="1"/>
+      <w:numFmt w:val="bullet"/>
+      <w:lvlText w:val=""/>
+      <w:lvlJc w:val="left"/>
+      <w:pPr>
+        <w:tabs>
+          <w:tab w:val="num" w:pos="2880"/>
+        </w:tabs>
+        <w:ind w:left="2880" w:hanging="360"/>
+      </w:pPr>
+      <w:rPr>
+        <w:rFonts w:ascii="Wingdings" w:hAnsi="Wingdings" w:hint="default"/>
+        <w:sz w:val="20"/>
+      </w:rPr>
+    </w:lvl>
+    <w:lvl w:ilvl="4" w:tentative="1">
+      <w:start w:val="1"/>
+      <w:numFmt w:val="bullet"/>
+      <w:lvlText w:val=""/>
+      <w:lvlJc w:val="left"/>
+      <w:pPr>
+        <w:tabs>
+          <w:tab w:val="num" w:pos="3600"/>
+        </w:tabs>
+        <w:ind w:left="3600" w:hanging="360"/>
+      </w:pPr>
+      <w:rPr>
+        <w:rFonts w:ascii="Wingdings" w:hAnsi="Wingdings" w:hint="default"/>
+        <w:sz w:val="20"/>
+      </w:rPr>
+    </w:lvl>
+    <w:lvl w:ilvl="5" w:tentative="1">
+      <w:start w:val="1"/>
+      <w:numFmt w:val="bullet"/>
+      <w:lvlText w:val=""/>
+      <w:lvlJc w:val="left"/>
+      <w:pPr>
+        <w:tabs>
+          <w:tab w:val="num" w:pos="4320"/>
+        </w:tabs>
+        <w:ind w:left="4320" w:hanging="360"/>
+      </w:pPr>
+      <w:rPr>
+        <w:rFonts w:ascii="Wingdings" w:hAnsi="Wingdings" w:hint="default"/>
+        <w:sz w:val="20"/>
+      </w:rPr>
+    </w:lvl>
+    <w:lvl w:ilvl="6" w:tentative="1">
+      <w:start w:val="1"/>
+      <w:numFmt w:val="bullet"/>
+      <w:lvlText w:val=""/>
+      <w:lvlJc w:val="left"/>
+      <w:pPr>
+        <w:tabs>
+          <w:tab w:val="num" w:pos="5040"/>
+        </w:tabs>
+        <w:ind w:left="5040" w:hanging="360"/>
+      </w:pPr>
+      <w:rPr>
+        <w:rFonts w:ascii="Wingdings" w:hAnsi="Wingdings" w:hint="default"/>
+        <w:sz w:val="20"/>
+      </w:rPr>
+    </w:lvl>
+    <w:lvl w:ilvl="7" w:tentative="1">
+      <w:start w:val="1"/>
+      <w:numFmt w:val="bullet"/>
+      <w:lvlText w:val=""/>
+      <w:lvlJc w:val="left"/>
+      <w:pPr>
+        <w:tabs>
+          <w:tab w:val="num" w:pos="5760"/>
+        </w:tabs>
+        <w:ind w:left="5760" w:hanging="360"/>
+      </w:pPr>
+      <w:rPr>
+        <w:rFonts w:ascii="Wingdings" w:hAnsi="Wingdings" w:hint="default"/>
+        <w:sz w:val="20"/>
+      </w:rPr>
+    </w:lvl>
+    <w:lvl w:ilvl="8" w:tentative="1">
+      <w:start w:val="1"/>
+      <w:numFmt w:val="bullet"/>
+      <w:lvlText w:val=""/>
+      <w:lvlJc w:val="left"/>
+      <w:pPr>
+        <w:tabs>
+          <w:tab w:val="num" w:pos="6480"/>
+        </w:tabs>
+        <w:ind w:left="6480" w:hanging="360"/>
+      </w:pPr>
+      <w:rPr>
+        <w:rFonts w:ascii="Wingdings" w:hAnsi="Wingdings" w:hint="default"/>
+        <w:sz w:val="20"/>
+      </w:rPr>
+    </w:lvl>
+  </w:abstractNum>
+  <w:abstractNum w:abstractNumId="9" w15:restartNumberingAfterBreak="0">
+    <w:nsid w:val="512E26C4"/>
+    <w:multiLevelType w:val="multilevel"/>
+    <w:tmpl w:val="FF9A4930"/>
+    <w:lvl w:ilvl="0">
+      <w:start w:val="1"/>
+      <w:numFmt w:val="bullet"/>
+      <w:lvlText w:val=""/>
+      <w:lvlJc w:val="left"/>
+      <w:pPr>
+        <w:tabs>
+          <w:tab w:val="num" w:pos="720"/>
+        </w:tabs>
+        <w:ind w:left="720" w:hanging="360"/>
+      </w:pPr>
+      <w:rPr>
+        <w:rFonts w:ascii="Wingdings" w:hAnsi="Wingdings" w:hint="default"/>
+        <w:sz w:val="20"/>
+      </w:rPr>
+    </w:lvl>
+    <w:lvl w:ilvl="1" w:tentative="1">
+      <w:start w:val="1"/>
+      <w:numFmt w:val="bullet"/>
+      <w:lvlText w:val="o"/>
+      <w:lvlJc w:val="left"/>
+      <w:pPr>
+        <w:tabs>
+          <w:tab w:val="num" w:pos="1440"/>
+        </w:tabs>
+        <w:ind w:left="1440" w:hanging="360"/>
+      </w:pPr>
+      <w:rPr>
+        <w:rFonts w:ascii="Courier New" w:hAnsi="Courier New" w:hint="default"/>
+        <w:sz w:val="20"/>
+      </w:rPr>
+    </w:lvl>
+    <w:lvl w:ilvl="2" w:tentative="1">
+      <w:start w:val="1"/>
+      <w:numFmt w:val="bullet"/>
+      <w:lvlText w:val=""/>
+      <w:lvlJc w:val="left"/>
+      <w:pPr>
+        <w:tabs>
+          <w:tab w:val="num" w:pos="2160"/>
+        </w:tabs>
+        <w:ind w:left="2160" w:hanging="360"/>
+      </w:pPr>
+      <w:rPr>
+        <w:rFonts w:ascii="Wingdings" w:hAnsi="Wingdings" w:hint="default"/>
+        <w:sz w:val="20"/>
+      </w:rPr>
+    </w:lvl>
+    <w:lvl w:ilvl="3" w:tentative="1">
+      <w:start w:val="1"/>
+      <w:numFmt w:val="bullet"/>
+      <w:lvlText w:val=""/>
+      <w:lvlJc w:val="left"/>
+      <w:pPr>
+        <w:tabs>
+          <w:tab w:val="num" w:pos="2880"/>
+        </w:tabs>
+        <w:ind w:left="2880" w:hanging="360"/>
+      </w:pPr>
+      <w:rPr>
+        <w:rFonts w:ascii="Wingdings" w:hAnsi="Wingdings" w:hint="default"/>
+        <w:sz w:val="20"/>
+      </w:rPr>
+    </w:lvl>
+    <w:lvl w:ilvl="4" w:tentative="1">
+      <w:start w:val="1"/>
+      <w:numFmt w:val="bullet"/>
+      <w:lvlText w:val=""/>
+      <w:lvlJc w:val="left"/>
+      <w:pPr>
+        <w:tabs>
+          <w:tab w:val="num" w:pos="3600"/>
+        </w:tabs>
+        <w:ind w:left="3600" w:hanging="360"/>
+      </w:pPr>
+      <w:rPr>
+        <w:rFonts w:ascii="Wingdings" w:hAnsi="Wingdings" w:hint="default"/>
+        <w:sz w:val="20"/>
+      </w:rPr>
+    </w:lvl>
+    <w:lvl w:ilvl="5" w:tentative="1">
+      <w:start w:val="1"/>
+      <w:numFmt w:val="bullet"/>
+      <w:lvlText w:val=""/>
+      <w:lvlJc w:val="left"/>
+      <w:pPr>
+        <w:tabs>
+          <w:tab w:val="num" w:pos="4320"/>
+        </w:tabs>
+        <w:ind w:left="4320" w:hanging="360"/>
+      </w:pPr>
+      <w:rPr>
+        <w:rFonts w:ascii="Wingdings" w:hAnsi="Wingdings" w:hint="default"/>
+        <w:sz w:val="20"/>
+      </w:rPr>
+    </w:lvl>
+    <w:lvl w:ilvl="6" w:tentative="1">
+      <w:start w:val="1"/>
+      <w:numFmt w:val="bullet"/>
+      <w:lvlText w:val=""/>
+      <w:lvlJc w:val="left"/>
+      <w:pPr>
+        <w:tabs>
+          <w:tab w:val="num" w:pos="5040"/>
+        </w:tabs>
+        <w:ind w:left="5040" w:hanging="360"/>
+      </w:pPr>
+      <w:rPr>
+        <w:rFonts w:ascii="Wingdings" w:hAnsi="Wingdings" w:hint="default"/>
+        <w:sz w:val="20"/>
+      </w:rPr>
+    </w:lvl>
+    <w:lvl w:ilvl="7" w:tentative="1">
+      <w:start w:val="1"/>
+      <w:numFmt w:val="bullet"/>
+      <w:lvlText w:val=""/>
+      <w:lvlJc w:val="left"/>
+      <w:pPr>
+        <w:tabs>
+          <w:tab w:val="num" w:pos="5760"/>
+        </w:tabs>
+        <w:ind w:left="5760" w:hanging="360"/>
+      </w:pPr>
+      <w:rPr>
+        <w:rFonts w:ascii="Wingdings" w:hAnsi="Wingdings" w:hint="default"/>
+        <w:sz w:val="20"/>
+      </w:rPr>
+    </w:lvl>
+    <w:lvl w:ilvl="8" w:tentative="1">
+      <w:start w:val="1"/>
+      <w:numFmt w:val="bullet"/>
+      <w:lvlText w:val=""/>
+      <w:lvlJc w:val="left"/>
+      <w:pPr>
+        <w:tabs>
+          <w:tab w:val="num" w:pos="6480"/>
+        </w:tabs>
+        <w:ind w:left="6480" w:hanging="360"/>
+      </w:pPr>
+      <w:rPr>
+        <w:rFonts w:ascii="Wingdings" w:hAnsi="Wingdings" w:hint="default"/>
+        <w:sz w:val="20"/>
+      </w:rPr>
+    </w:lvl>
+  </w:abstractNum>
+  <w:abstractNum w:abstractNumId="10" w15:restartNumberingAfterBreak="0">
+    <w:nsid w:val="5FD94105"/>
+    <w:multiLevelType w:val="multilevel"/>
+    <w:tmpl w:val="27B21B32"/>
+    <w:lvl w:ilvl="0">
+      <w:start w:val="1"/>
+      <w:numFmt w:val="bullet"/>
+      <w:lvlText w:val=""/>
+      <w:lvlJc w:val="left"/>
+      <w:pPr>
+        <w:tabs>
+          <w:tab w:val="num" w:pos="720"/>
+        </w:tabs>
+        <w:ind w:left="720" w:hanging="360"/>
+      </w:pPr>
+      <w:rPr>
+        <w:rFonts w:ascii="Symbol" w:hAnsi="Symbol" w:hint="default"/>
+        <w:sz w:val="20"/>
+      </w:rPr>
+    </w:lvl>
+    <w:lvl w:ilvl="1" w:tentative="1">
+      <w:start w:val="1"/>
+      <w:numFmt w:val="bullet"/>
+      <w:lvlText w:val="o"/>
+      <w:lvlJc w:val="left"/>
+      <w:pPr>
+        <w:tabs>
+          <w:tab w:val="num" w:pos="1440"/>
+        </w:tabs>
+        <w:ind w:left="1440" w:hanging="360"/>
+      </w:pPr>
+      <w:rPr>
+        <w:rFonts w:ascii="Courier New" w:hAnsi="Courier New" w:hint="default"/>
+        <w:sz w:val="20"/>
+      </w:rPr>
+    </w:lvl>
+    <w:lvl w:ilvl="2" w:tentative="1">
+      <w:start w:val="1"/>
+      <w:numFmt w:val="bullet"/>
+      <w:lvlText w:val=""/>
+      <w:lvlJc w:val="left"/>
+      <w:pPr>
+        <w:tabs>
+          <w:tab w:val="num" w:pos="2160"/>
+        </w:tabs>
+        <w:ind w:left="2160" w:hanging="360"/>
+      </w:pPr>
+      <w:rPr>
+        <w:rFonts w:ascii="Wingdings" w:hAnsi="Wingdings" w:hint="default"/>
+        <w:sz w:val="20"/>
+      </w:rPr>
+    </w:lvl>
+    <w:lvl w:ilvl="3" w:tentative="1">
+      <w:start w:val="1"/>
+      <w:numFmt w:val="bullet"/>
+      <w:lvlText w:val=""/>
+      <w:lvlJc w:val="left"/>
+      <w:pPr>
+        <w:tabs>
+          <w:tab w:val="num" w:pos="2880"/>
+        </w:tabs>
+        <w:ind w:left="2880" w:hanging="360"/>
+      </w:pPr>
+      <w:rPr>
+        <w:rFonts w:ascii="Wingdings" w:hAnsi="Wingdings" w:hint="default"/>
+        <w:sz w:val="20"/>
+      </w:rPr>
+    </w:lvl>
+    <w:lvl w:ilvl="4" w:tentative="1">
+      <w:start w:val="1"/>
+      <w:numFmt w:val="bullet"/>
+      <w:lvlText w:val=""/>
+      <w:lvlJc w:val="left"/>
+      <w:pPr>
+        <w:tabs>
+          <w:tab w:val="num" w:pos="3600"/>
+        </w:tabs>
+        <w:ind w:left="3600" w:hanging="360"/>
+      </w:pPr>
+      <w:rPr>
+        <w:rFonts w:ascii="Wingdings" w:hAnsi="Wingdings" w:hint="default"/>
+        <w:sz w:val="20"/>
+      </w:rPr>
+    </w:lvl>
+    <w:lvl w:ilvl="5" w:tentative="1">
+      <w:start w:val="1"/>
+      <w:numFmt w:val="bullet"/>
+      <w:lvlText w:val=""/>
+      <w:lvlJc w:val="left"/>
+      <w:pPr>
+        <w:tabs>
+          <w:tab w:val="num" w:pos="4320"/>
+        </w:tabs>
+        <w:ind w:left="4320" w:hanging="360"/>
+      </w:pPr>
+      <w:rPr>
+        <w:rFonts w:ascii="Wingdings" w:hAnsi="Wingdings" w:hint="default"/>
+        <w:sz w:val="20"/>
+      </w:rPr>
+    </w:lvl>
+    <w:lvl w:ilvl="6" w:tentative="1">
+      <w:start w:val="1"/>
+      <w:numFmt w:val="bullet"/>
+      <w:lvlText w:val=""/>
+      <w:lvlJc w:val="left"/>
+      <w:pPr>
+        <w:tabs>
+          <w:tab w:val="num" w:pos="5040"/>
+        </w:tabs>
+        <w:ind w:left="5040" w:hanging="360"/>
+      </w:pPr>
+      <w:rPr>
+        <w:rFonts w:ascii="Wingdings" w:hAnsi="Wingdings" w:hint="default"/>
+        <w:sz w:val="20"/>
+      </w:rPr>
+    </w:lvl>
+    <w:lvl w:ilvl="7" w:tentative="1">
+      <w:start w:val="1"/>
+      <w:numFmt w:val="bullet"/>
+      <w:lvlText w:val=""/>
+      <w:lvlJc w:val="left"/>
+      <w:pPr>
+        <w:tabs>
+          <w:tab w:val="num" w:pos="5760"/>
+        </w:tabs>
+        <w:ind w:left="5760" w:hanging="360"/>
+      </w:pPr>
+      <w:rPr>
+        <w:rFonts w:ascii="Wingdings" w:hAnsi="Wingdings" w:hint="default"/>
+        <w:sz w:val="20"/>
+      </w:rPr>
+    </w:lvl>
+    <w:lvl w:ilvl="8" w:tentative="1">
+      <w:start w:val="1"/>
+      <w:numFmt w:val="bullet"/>
+      <w:lvlText w:val=""/>
+      <w:lvlJc w:val="left"/>
+      <w:pPr>
+        <w:tabs>
+          <w:tab w:val="num" w:pos="6480"/>
+        </w:tabs>
+        <w:ind w:left="6480" w:hanging="360"/>
+      </w:pPr>
+      <w:rPr>
+        <w:rFonts w:ascii="Wingdings" w:hAnsi="Wingdings" w:hint="default"/>
+        <w:sz w:val="20"/>
+      </w:rPr>
+    </w:lvl>
+  </w:abstractNum>
+  <w:abstractNum w:abstractNumId="11" w15:restartNumberingAfterBreak="0">
+    <w:nsid w:val="734A1C52"/>
+    <w:multiLevelType w:val="multilevel"/>
+    <w:tmpl w:val="66204BB4"/>
+    <w:lvl w:ilvl="0">
+      <w:start w:val="1"/>
+      <w:numFmt w:val="bullet"/>
+      <w:lvlText w:val=""/>
+      <w:lvlJc w:val="left"/>
+      <w:pPr>
+        <w:tabs>
+          <w:tab w:val="num" w:pos="720"/>
+        </w:tabs>
+        <w:ind w:left="720" w:hanging="360"/>
+      </w:pPr>
+      <w:rPr>
+        <w:rFonts w:ascii="Symbol" w:hAnsi="Symbol" w:hint="default"/>
+        <w:sz w:val="20"/>
+      </w:rPr>
+    </w:lvl>
+    <w:lvl w:ilvl="1" w:tentative="1">
+      <w:start w:val="1"/>
+      <w:numFmt w:val="bullet"/>
+      <w:lvlText w:val="o"/>
+      <w:lvlJc w:val="left"/>
+      <w:pPr>
+        <w:tabs>
+          <w:tab w:val="num" w:pos="1440"/>
+        </w:tabs>
+        <w:ind w:left="1440" w:hanging="360"/>
+      </w:pPr>
+      <w:rPr>
+        <w:rFonts w:ascii="Courier New" w:hAnsi="Courier New" w:hint="default"/>
+        <w:sz w:val="20"/>
+      </w:rPr>
+    </w:lvl>
+    <w:lvl w:ilvl="2" w:tentative="1">
+      <w:start w:val="1"/>
+      <w:numFmt w:val="bullet"/>
+      <w:lvlText w:val=""/>
+      <w:lvlJc w:val="left"/>
+      <w:pPr>
+        <w:tabs>
+          <w:tab w:val="num" w:pos="2160"/>
+        </w:tabs>
+        <w:ind w:left="2160" w:hanging="360"/>
+      </w:pPr>
+      <w:rPr>
+        <w:rFonts w:ascii="Wingdings" w:hAnsi="Wingdings" w:hint="default"/>
+        <w:sz w:val="20"/>
+      </w:rPr>
+    </w:lvl>
+    <w:lvl w:ilvl="3" w:tentative="1">
+      <w:start w:val="1"/>
+      <w:numFmt w:val="bullet"/>
+      <w:lvlText w:val=""/>
+      <w:lvlJc w:val="left"/>
+      <w:pPr>
+        <w:tabs>
+          <w:tab w:val="num" w:pos="2880"/>
+        </w:tabs>
+        <w:ind w:left="2880" w:hanging="360"/>
+      </w:pPr>
+      <w:rPr>
+        <w:rFonts w:ascii="Wingdings" w:hAnsi="Wingdings" w:hint="default"/>
+        <w:sz w:val="20"/>
+      </w:rPr>
+    </w:lvl>
+    <w:lvl w:ilvl="4" w:tentative="1">
+      <w:start w:val="1"/>
+      <w:numFmt w:val="bullet"/>
+      <w:lvlText w:val=""/>
+      <w:lvlJc w:val="left"/>
+      <w:pPr>
+        <w:tabs>
+          <w:tab w:val="num" w:pos="3600"/>
+        </w:tabs>
+        <w:ind w:left="3600" w:hanging="360"/>
+      </w:pPr>
+      <w:rPr>
+        <w:rFonts w:ascii="Wingdings" w:hAnsi="Wingdings" w:hint="default"/>
+        <w:sz w:val="20"/>
+      </w:rPr>
+    </w:lvl>
+    <w:lvl w:ilvl="5" w:tentative="1">
+      <w:start w:val="1"/>
+      <w:numFmt w:val="bullet"/>
+      <w:lvlText w:val=""/>
+      <w:lvlJc w:val="left"/>
+      <w:pPr>
+        <w:tabs>
+          <w:tab w:val="num" w:pos="4320"/>
+        </w:tabs>
+        <w:ind w:left="4320" w:hanging="360"/>
+      </w:pPr>
+      <w:rPr>
+        <w:rFonts w:ascii="Wingdings" w:hAnsi="Wingdings" w:hint="default"/>
+        <w:sz w:val="20"/>
+      </w:rPr>
+    </w:lvl>
+    <w:lvl w:ilvl="6" w:tentative="1">
+      <w:start w:val="1"/>
+      <w:numFmt w:val="bullet"/>
+      <w:lvlText w:val=""/>
+      <w:lvlJc w:val="left"/>
+      <w:pPr>
+        <w:tabs>
+          <w:tab w:val="num" w:pos="5040"/>
+        </w:tabs>
+        <w:ind w:left="5040" w:hanging="360"/>
+      </w:pPr>
+      <w:rPr>
+        <w:rFonts w:ascii="Wingdings" w:hAnsi="Wingdings" w:hint="default"/>
+        <w:sz w:val="20"/>
+      </w:rPr>
+    </w:lvl>
+    <w:lvl w:ilvl="7" w:tentative="1">
+      <w:start w:val="1"/>
+      <w:numFmt w:val="bullet"/>
+      <w:lvlText w:val=""/>
+      <w:lvlJc w:val="left"/>
+      <w:pPr>
+        <w:tabs>
+          <w:tab w:val="num" w:pos="5760"/>
+        </w:tabs>
+        <w:ind w:left="5760" w:hanging="360"/>
+      </w:pPr>
+      <w:rPr>
+        <w:rFonts w:ascii="Wingdings" w:hAnsi="Wingdings" w:hint="default"/>
+        <w:sz w:val="20"/>
+      </w:rPr>
+    </w:lvl>
+    <w:lvl w:ilvl="8" w:tentative="1">
+      <w:start w:val="1"/>
+      <w:numFmt w:val="bullet"/>
+      <w:lvlText w:val=""/>
+      <w:lvlJc w:val="left"/>
+      <w:pPr>
+        <w:tabs>
+          <w:tab w:val="num" w:pos="6480"/>
+        </w:tabs>
+        <w:ind w:left="6480" w:hanging="360"/>
+      </w:pPr>
+      <w:rPr>
+        <w:rFonts w:ascii="Wingdings" w:hAnsi="Wingdings" w:hint="default"/>
+        <w:sz w:val="20"/>
+      </w:rPr>
+    </w:lvl>
+  </w:abstractNum>
+  <w:abstractNum w:abstractNumId="12" w15:restartNumberingAfterBreak="0">
+    <w:nsid w:val="76475CD2"/>
+    <w:multiLevelType w:val="hybridMultilevel"/>
+    <w:tmpl w:val="1062013A"/>
+    <w:lvl w:ilvl="0" w:tplc="DDE406D2">
+      <w:start w:val="2"/>
+      <w:numFmt w:val="bullet"/>
+      <w:lvlText w:val="-"/>
+      <w:lvlJc w:val="left"/>
+      <w:pPr>
+        <w:ind w:left="1440" w:hanging="360"/>
+      </w:pPr>
+      <w:rPr>
+        <w:rFonts w:ascii="Times New Roman" w:eastAsiaTheme="minorHAnsi" w:hAnsi="Times New Roman" w:cs="Times New Roman" w:hint="default"/>
+      </w:rPr>
+    </w:lvl>
+    <w:lvl w:ilvl="1" w:tplc="240A0003" w:tentative="1">
+      <w:start w:val="1"/>
+      <w:numFmt w:val="bullet"/>
+      <w:lvlText w:val="o"/>
+      <w:lvlJc w:val="left"/>
+      <w:pPr>
+        <w:ind w:left="2160" w:hanging="360"/>
+      </w:pPr>
+      <w:rPr>
+        <w:rFonts w:ascii="Courier New" w:hAnsi="Courier New" w:cs="Courier New" w:hint="default"/>
+      </w:rPr>
+    </w:lvl>
+    <w:lvl w:ilvl="2" w:tplc="240A0005" w:tentative="1">
+      <w:start w:val="1"/>
+      <w:numFmt w:val="bullet"/>
+      <w:lvlText w:val=""/>
+      <w:lvlJc w:val="left"/>
+      <w:pPr>
+        <w:ind w:left="2880" w:hanging="360"/>
+      </w:pPr>
+      <w:rPr>
+        <w:rFonts w:ascii="Wingdings" w:hAnsi="Wingdings" w:hint="default"/>
+      </w:rPr>
+    </w:lvl>
+    <w:lvl w:ilvl="3" w:tplc="240A0001" w:tentative="1">
+      <w:start w:val="1"/>
+      <w:numFmt w:val="bullet"/>
+      <w:lvlText w:val=""/>
+      <w:lvlJc w:val="left"/>
+      <w:pPr>
+        <w:ind w:left="3600" w:hanging="360"/>
+      </w:pPr>
+      <w:rPr>
+        <w:rFonts w:ascii="Symbol" w:hAnsi="Symbol" w:hint="default"/>
+      </w:rPr>
+    </w:lvl>
+    <w:lvl w:ilvl="4" w:tplc="240A0003" w:tentative="1">
+      <w:start w:val="1"/>
+      <w:numFmt w:val="bullet"/>
+      <w:lvlText w:val="o"/>
+      <w:lvlJc w:val="left"/>
+      <w:pPr>
+        <w:ind w:left="4320" w:hanging="360"/>
+      </w:pPr>
+      <w:rPr>
+        <w:rFonts w:ascii="Courier New" w:hAnsi="Courier New" w:cs="Courier New" w:hint="default"/>
+      </w:rPr>
+    </w:lvl>
+    <w:lvl w:ilvl="5" w:tplc="240A0005" w:tentative="1">
+      <w:start w:val="1"/>
+      <w:numFmt w:val="bullet"/>
+      <w:lvlText w:val=""/>
+      <w:lvlJc w:val="left"/>
+      <w:pPr>
+        <w:ind w:left="5040" w:hanging="360"/>
+      </w:pPr>
+      <w:rPr>
+        <w:rFonts w:ascii="Wingdings" w:hAnsi="Wingdings" w:hint="default"/>
+      </w:rPr>
+    </w:lvl>
+    <w:lvl w:ilvl="6" w:tplc="240A0001" w:tentative="1">
+      <w:start w:val="1"/>
+      <w:numFmt w:val="bullet"/>
+      <w:lvlText w:val=""/>
+      <w:lvlJc w:val="left"/>
+      <w:pPr>
+        <w:ind w:left="5760" w:hanging="360"/>
+      </w:pPr>
+      <w:rPr>
+        <w:rFonts w:ascii="Symbol" w:hAnsi="Symbol" w:hint="default"/>
+      </w:rPr>
+    </w:lvl>
+    <w:lvl w:ilvl="7" w:tplc="240A0003" w:tentative="1">
+      <w:start w:val="1"/>
+      <w:numFmt w:val="bullet"/>
+      <w:lvlText w:val="o"/>
+      <w:lvlJc w:val="left"/>
+      <w:pPr>
+        <w:ind w:left="6480" w:hanging="360"/>
+      </w:pPr>
+      <w:rPr>
+        <w:rFonts w:ascii="Courier New" w:hAnsi="Courier New" w:cs="Courier New" w:hint="default"/>
+      </w:rPr>
+    </w:lvl>
+    <w:lvl w:ilvl="8" w:tplc="240A0005" w:tentative="1">
+      <w:start w:val="1"/>
+      <w:numFmt w:val="bullet"/>
+      <w:lvlText w:val=""/>
+      <w:lvlJc w:val="left"/>
+      <w:pPr>
+        <w:ind w:left="7200" w:hanging="360"/>
+      </w:pPr>
+      <w:rPr>
+        <w:rFonts w:ascii="Wingdings" w:hAnsi="Wingdings" w:hint="default"/>
+      </w:rPr>
+    </w:lvl>
+  </w:abstractNum>
+  <w:abstractNum w:abstractNumId="13" w15:restartNumberingAfterBreak="0">
+    <w:nsid w:val="776078FE"/>
+    <w:multiLevelType w:val="multilevel"/>
+    <w:tmpl w:val="E95E584A"/>
+    <w:lvl w:ilvl="0">
+      <w:start w:val="1"/>
+      <w:numFmt w:val="bullet"/>
+      <w:lvlText w:val=""/>
+      <w:lvlJc w:val="left"/>
+      <w:pPr>
+        <w:tabs>
+          <w:tab w:val="num" w:pos="720"/>
+        </w:tabs>
+        <w:ind w:left="720" w:hanging="360"/>
+      </w:pPr>
+      <w:rPr>
+        <w:rFonts w:ascii="Symbol" w:hAnsi="Symbol" w:hint="default"/>
+        <w:sz w:val="20"/>
+      </w:rPr>
+    </w:lvl>
+    <w:lvl w:ilvl="1" w:tentative="1">
+      <w:start w:val="1"/>
+      <w:numFmt w:val="bullet"/>
+      <w:lvlText w:val="o"/>
+      <w:lvlJc w:val="left"/>
+      <w:pPr>
+        <w:tabs>
+          <w:tab w:val="num" w:pos="1440"/>
+        </w:tabs>
+        <w:ind w:left="1440" w:hanging="360"/>
+      </w:pPr>
+      <w:rPr>
+        <w:rFonts w:ascii="Courier New" w:hAnsi="Courier New" w:hint="default"/>
+        <w:sz w:val="20"/>
+      </w:rPr>
+    </w:lvl>
+    <w:lvl w:ilvl="2" w:tentative="1">
+      <w:start w:val="1"/>
+      <w:numFmt w:val="bullet"/>
+      <w:lvlText w:val=""/>
+      <w:lvlJc w:val="left"/>
+      <w:pPr>
+        <w:tabs>
+          <w:tab w:val="num" w:pos="2160"/>
+        </w:tabs>
+        <w:ind w:left="2160" w:hanging="360"/>
+      </w:pPr>
+      <w:rPr>
+        <w:rFonts w:ascii="Wingdings" w:hAnsi="Wingdings" w:hint="default"/>
+        <w:sz w:val="20"/>
+      </w:rPr>
+    </w:lvl>
+    <w:lvl w:ilvl="3" w:tentative="1">
+      <w:start w:val="1"/>
+      <w:numFmt w:val="bullet"/>
+      <w:lvlText w:val=""/>
+      <w:lvlJc w:val="left"/>
+      <w:pPr>
+        <w:tabs>
+          <w:tab w:val="num" w:pos="2880"/>
+        </w:tabs>
+        <w:ind w:left="2880" w:hanging="360"/>
+      </w:pPr>
+      <w:rPr>
+        <w:rFonts w:ascii="Wingdings" w:hAnsi="Wingdings" w:hint="default"/>
+        <w:sz w:val="20"/>
+      </w:rPr>
+    </w:lvl>
+    <w:lvl w:ilvl="4" w:tentative="1">
+      <w:start w:val="1"/>
+      <w:numFmt w:val="bullet"/>
+      <w:lvlText w:val=""/>
+      <w:lvlJc w:val="left"/>
+      <w:pPr>
+        <w:tabs>
+          <w:tab w:val="num" w:pos="3600"/>
+        </w:tabs>
+        <w:ind w:left="3600" w:hanging="360"/>
+      </w:pPr>
+      <w:rPr>
+        <w:rFonts w:ascii="Wingdings" w:hAnsi="Wingdings" w:hint="default"/>
+        <w:sz w:val="20"/>
+      </w:rPr>
+    </w:lvl>
+    <w:lvl w:ilvl="5" w:tentative="1">
+      <w:start w:val="1"/>
+      <w:numFmt w:val="bullet"/>
+      <w:lvlText w:val=""/>
+      <w:lvlJc w:val="left"/>
+      <w:pPr>
+        <w:tabs>
+          <w:tab w:val="num" w:pos="4320"/>
+        </w:tabs>
+        <w:ind w:left="4320" w:hanging="360"/>
+      </w:pPr>
+      <w:rPr>
+        <w:rFonts w:ascii="Wingdings" w:hAnsi="Wingdings" w:hint="default"/>
+        <w:sz w:val="20"/>
+      </w:rPr>
+    </w:lvl>
+    <w:lvl w:ilvl="6" w:tentative="1">
+      <w:start w:val="1"/>
+      <w:numFmt w:val="bullet"/>
+      <w:lvlText w:val=""/>
+      <w:lvlJc w:val="left"/>
+      <w:pPr>
+        <w:tabs>
+          <w:tab w:val="num" w:pos="5040"/>
+        </w:tabs>
+        <w:ind w:left="5040" w:hanging="360"/>
+      </w:pPr>
+      <w:rPr>
+        <w:rFonts w:ascii="Wingdings" w:hAnsi="Wingdings" w:hint="default"/>
+        <w:sz w:val="20"/>
+      </w:rPr>
+    </w:lvl>
+    <w:lvl w:ilvl="7" w:tentative="1">
+      <w:start w:val="1"/>
+      <w:numFmt w:val="bullet"/>
+      <w:lvlText w:val=""/>
+      <w:lvlJc w:val="left"/>
+      <w:pPr>
+        <w:tabs>
+          <w:tab w:val="num" w:pos="5760"/>
+        </w:tabs>
+        <w:ind w:left="5760" w:hanging="360"/>
+      </w:pPr>
+      <w:rPr>
+        <w:rFonts w:ascii="Wingdings" w:hAnsi="Wingdings" w:hint="default"/>
+        <w:sz w:val="20"/>
+      </w:rPr>
+    </w:lvl>
+    <w:lvl w:ilvl="8" w:tentative="1">
+      <w:start w:val="1"/>
+      <w:numFmt w:val="bullet"/>
+      <w:lvlText w:val=""/>
+      <w:lvlJc w:val="left"/>
+      <w:pPr>
+        <w:tabs>
+          <w:tab w:val="num" w:pos="6480"/>
+        </w:tabs>
+        <w:ind w:left="6480" w:hanging="360"/>
+      </w:pPr>
+      <w:rPr>
+        <w:rFonts w:ascii="Wingdings" w:hAnsi="Wingdings" w:hint="default"/>
+        <w:sz w:val="20"/>
+      </w:rPr>
+    </w:lvl>
+  </w:abstractNum>
+  <w:abstractNum w:abstractNumId="14" w15:restartNumberingAfterBreak="0">
+    <w:nsid w:val="7C0403FA"/>
+    <w:multiLevelType w:val="multilevel"/>
+    <w:tmpl w:val="96EC59EE"/>
+    <w:lvl w:ilvl="0">
+      <w:start w:val="1"/>
+      <w:numFmt w:val="bullet"/>
+      <w:lvlText w:val=""/>
+      <w:lvlJc w:val="left"/>
+      <w:pPr>
+        <w:tabs>
+          <w:tab w:val="num" w:pos="720"/>
+        </w:tabs>
+        <w:ind w:left="720" w:hanging="360"/>
+      </w:pPr>
+      <w:rPr>
+        <w:rFonts w:ascii="Symbol" w:hAnsi="Symbol" w:hint="default"/>
+        <w:sz w:val="20"/>
+      </w:rPr>
+    </w:lvl>
+    <w:lvl w:ilvl="1" w:tentative="1">
+      <w:start w:val="1"/>
+      <w:numFmt w:val="bullet"/>
+      <w:lvlText w:val="o"/>
+      <w:lvlJc w:val="left"/>
+      <w:pPr>
+        <w:tabs>
+          <w:tab w:val="num" w:pos="1440"/>
+        </w:tabs>
+        <w:ind w:left="1440" w:hanging="360"/>
+      </w:pPr>
+      <w:rPr>
+        <w:rFonts w:ascii="Courier New" w:hAnsi="Courier New" w:hint="default"/>
+        <w:sz w:val="20"/>
+      </w:rPr>
+    </w:lvl>
+    <w:lvl w:ilvl="2" w:tentative="1">
+      <w:start w:val="1"/>
+      <w:numFmt w:val="bullet"/>
+      <w:lvlText w:val=""/>
+      <w:lvlJc w:val="left"/>
+      <w:pPr>
+        <w:tabs>
+          <w:tab w:val="num" w:pos="2160"/>
+        </w:tabs>
+        <w:ind w:left="2160" w:hanging="360"/>
+      </w:pPr>
+      <w:rPr>
+        <w:rFonts w:ascii="Wingdings" w:hAnsi="Wingdings" w:hint="default"/>
+        <w:sz w:val="20"/>
+      </w:rPr>
+    </w:lvl>
+    <w:lvl w:ilvl="3" w:tentative="1">
+      <w:start w:val="1"/>
+      <w:numFmt w:val="bullet"/>
+      <w:lvlText w:val=""/>
+      <w:lvlJc w:val="left"/>
+      <w:pPr>
+        <w:tabs>
+          <w:tab w:val="num" w:pos="2880"/>
+        </w:tabs>
+        <w:ind w:left="2880" w:hanging="360"/>
+      </w:pPr>
+      <w:rPr>
+        <w:rFonts w:ascii="Wingdings" w:hAnsi="Wingdings" w:hint="default"/>
+        <w:sz w:val="20"/>
+      </w:rPr>
+    </w:lvl>
+    <w:lvl w:ilvl="4" w:tentative="1">
+      <w:start w:val="1"/>
+      <w:numFmt w:val="bullet"/>
+      <w:lvlText w:val=""/>
+      <w:lvlJc w:val="left"/>
+      <w:pPr>
+        <w:tabs>
+          <w:tab w:val="num" w:pos="3600"/>
+        </w:tabs>
+        <w:ind w:left="3600" w:hanging="360"/>
+      </w:pPr>
+      <w:rPr>
+        <w:rFonts w:ascii="Wingdings" w:hAnsi="Wingdings" w:hint="default"/>
+        <w:sz w:val="20"/>
+      </w:rPr>
+    </w:lvl>
+    <w:lvl w:ilvl="5" w:tentative="1">
+      <w:start w:val="1"/>
+      <w:numFmt w:val="bullet"/>
+      <w:lvlText w:val=""/>
+      <w:lvlJc w:val="left"/>
+      <w:pPr>
+        <w:tabs>
+          <w:tab w:val="num" w:pos="4320"/>
+        </w:tabs>
+        <w:ind w:left="4320" w:hanging="360"/>
+      </w:pPr>
+      <w:rPr>
+        <w:rFonts w:ascii="Wingdings" w:hAnsi="Wingdings" w:hint="default"/>
+        <w:sz w:val="20"/>
+      </w:rPr>
+    </w:lvl>
+    <w:lvl w:ilvl="6" w:tentative="1">
+      <w:start w:val="1"/>
+      <w:numFmt w:val="bullet"/>
+      <w:lvlText w:val=""/>
+      <w:lvlJc w:val="left"/>
+      <w:pPr>
+        <w:tabs>
+          <w:tab w:val="num" w:pos="5040"/>
+        </w:tabs>
+        <w:ind w:left="5040" w:hanging="360"/>
+      </w:pPr>
+      <w:rPr>
+        <w:rFonts w:ascii="Wingdings" w:hAnsi="Wingdings" w:hint="default"/>
+        <w:sz w:val="20"/>
+      </w:rPr>
+    </w:lvl>
+    <w:lvl w:ilvl="7" w:tentative="1">
+      <w:start w:val="1"/>
+      <w:numFmt w:val="bullet"/>
+      <w:lvlText w:val=""/>
+      <w:lvlJc w:val="left"/>
+      <w:pPr>
+        <w:tabs>
+          <w:tab w:val="num" w:pos="5760"/>
+        </w:tabs>
+        <w:ind w:left="5760" w:hanging="360"/>
+      </w:pPr>
+      <w:rPr>
+        <w:rFonts w:ascii="Wingdings" w:hAnsi="Wingdings" w:hint="default"/>
+        <w:sz w:val="20"/>
+      </w:rPr>
+    </w:lvl>
+    <w:lvl w:ilvl="8" w:tentative="1">
+      <w:start w:val="1"/>
+      <w:numFmt w:val="bullet"/>
+      <w:lvlText w:val=""/>
+      <w:lvlJc w:val="left"/>
+      <w:pPr>
+        <w:tabs>
+          <w:tab w:val="num" w:pos="6480"/>
+        </w:tabs>
+        <w:ind w:left="6480" w:hanging="360"/>
+      </w:pPr>
+      <w:rPr>
+        <w:rFonts w:ascii="Wingdings" w:hAnsi="Wingdings" w:hint="default"/>
+        <w:sz w:val="20"/>
+      </w:rPr>
+    </w:lvl>
+  </w:abstractNum>
+  <w:abstractNum w:abstractNumId="15" w15:restartNumberingAfterBreak="0">
+    <w:nsid w:val="7FF2312E"/>
+    <w:multiLevelType w:val="hybridMultilevel"/>
+    <w:tmpl w:val="B42A438C"/>
+    <w:lvl w:ilvl="0" w:tplc="240A000F">
+      <w:start w:val="1"/>
+      <w:numFmt w:val="decimal"/>
+      <w:lvlText w:val="%1."/>
+      <w:lvlJc w:val="left"/>
+      <w:pPr>
+        <w:ind w:left="720" w:hanging="360"/>
+      </w:pPr>
+      <w:rPr>
+        <w:rFonts w:hint="default"/>
+      </w:rPr>
+    </w:lvl>
+    <w:lvl w:ilvl="1" w:tplc="240A0019" w:tentative="1">
+      <w:start w:val="1"/>
+      <w:numFmt w:val="lowerLetter"/>
+      <w:lvlText w:val="%2."/>
+      <w:lvlJc w:val="left"/>
+      <w:pPr>
+        <w:ind w:left="1440" w:hanging="360"/>
+      </w:pPr>
+    </w:lvl>
+    <w:lvl w:ilvl="2" w:tplc="240A001B" w:tentative="1">
+      <w:start w:val="1"/>
+      <w:numFmt w:val="lowerRoman"/>
+      <w:lvlText w:val="%3."/>
+      <w:lvlJc w:val="right"/>
+      <w:pPr>
+        <w:ind w:left="2160" w:hanging="180"/>
+      </w:pPr>
+    </w:lvl>
+    <w:lvl w:ilvl="3" w:tplc="240A000F" w:tentative="1">
+      <w:start w:val="1"/>
+      <w:numFmt w:val="decimal"/>
+      <w:lvlText w:val="%4."/>
+      <w:lvlJc w:val="left"/>
+      <w:pPr>
+        <w:ind w:left="2880" w:hanging="360"/>
+      </w:pPr>
+    </w:lvl>
+    <w:lvl w:ilvl="4" w:tplc="240A0019" w:tentative="1">
+      <w:start w:val="1"/>
+      <w:numFmt w:val="lowerLetter"/>
+      <w:lvlText w:val="%5."/>
+      <w:lvlJc w:val="left"/>
+      <w:pPr>
+        <w:ind w:left="3600" w:hanging="360"/>
+      </w:pPr>
+    </w:lvl>
+    <w:lvl w:ilvl="5" w:tplc="240A001B" w:tentative="1">
+      <w:start w:val="1"/>
+      <w:numFmt w:val="lowerRoman"/>
+      <w:lvlText w:val="%6."/>
+      <w:lvlJc w:val="right"/>
+      <w:pPr>
+        <w:ind w:left="4320" w:hanging="180"/>
+      </w:pPr>
+    </w:lvl>
+    <w:lvl w:ilvl="6" w:tplc="240A000F" w:tentative="1">
+      <w:start w:val="1"/>
+      <w:numFmt w:val="decimal"/>
+      <w:lvlText w:val="%7."/>
+      <w:lvlJc w:val="left"/>
+      <w:pPr>
+        <w:ind w:left="5040" w:hanging="360"/>
+      </w:pPr>
+    </w:lvl>
+    <w:lvl w:ilvl="7" w:tplc="240A0019" w:tentative="1">
+      <w:start w:val="1"/>
+      <w:numFmt w:val="lowerLetter"/>
+      <w:lvlText w:val="%8."/>
+      <w:lvlJc w:val="left"/>
+      <w:pPr>
+        <w:ind w:left="5760" w:hanging="360"/>
+      </w:pPr>
+    </w:lvl>
+    <w:lvl w:ilvl="8" w:tplc="240A001B" w:tentative="1">
+      <w:start w:val="1"/>
+      <w:numFmt w:val="lowerRoman"/>
+      <w:lvlText w:val="%9."/>
+      <w:lvlJc w:val="right"/>
+      <w:pPr>
+        <w:ind w:left="6480" w:hanging="180"/>
+      </w:pPr>
+    </w:lvl>
+  </w:abstractNum>
   <w:num w:numId="1" w16cid:durableId="1109394719">
     <w:abstractNumId w:val="2"/>
   </w:num>
@@ -1093,6 +5462,42 @@
   </w:num>
   <w:num w:numId="4" w16cid:durableId="55397896">
     <w:abstractNumId w:val="3"/>
+  </w:num>
+  <w:num w:numId="5" w16cid:durableId="1261983759">
+    <w:abstractNumId w:val="8"/>
+  </w:num>
+  <w:num w:numId="6" w16cid:durableId="1775788915">
+    <w:abstractNumId w:val="9"/>
+  </w:num>
+  <w:num w:numId="7" w16cid:durableId="841626559">
+    <w:abstractNumId w:val="12"/>
+  </w:num>
+  <w:num w:numId="8" w16cid:durableId="1748651584">
+    <w:abstractNumId w:val="10"/>
+  </w:num>
+  <w:num w:numId="9" w16cid:durableId="1720594109">
+    <w:abstractNumId w:val="4"/>
+  </w:num>
+  <w:num w:numId="10" w16cid:durableId="965739946">
+    <w:abstractNumId w:val="14"/>
+  </w:num>
+  <w:num w:numId="11" w16cid:durableId="1594700253">
+    <w:abstractNumId w:val="7"/>
+  </w:num>
+  <w:num w:numId="12" w16cid:durableId="1453672223">
+    <w:abstractNumId w:val="11"/>
+  </w:num>
+  <w:num w:numId="13" w16cid:durableId="1298343102">
+    <w:abstractNumId w:val="13"/>
+  </w:num>
+  <w:num w:numId="14" w16cid:durableId="418016704">
+    <w:abstractNumId w:val="5"/>
+  </w:num>
+  <w:num w:numId="15" w16cid:durableId="1988777552">
+    <w:abstractNumId w:val="6"/>
+  </w:num>
+  <w:num w:numId="16" w16cid:durableId="1435252214">
+    <w:abstractNumId w:val="15"/>
   </w:num>
 </w:numbering>
 </file>
@@ -1700,7 +6105,6 @@
   <w:style w:type="character" w:default="1" w:styleId="Fuentedeprrafopredeter">
     <w:name w:val="Default Paragraph Font"/>
     <w:uiPriority w:val="1"/>
-    <w:semiHidden/>
     <w:unhideWhenUsed/>
   </w:style>
   <w:style w:type="table" w:default="1" w:styleId="Tablanormal">

</xml_diff>